<commit_message>
update after a year lol
</commit_message>
<xml_diff>
--- a/files/cv_sep23.docx
+++ b/files/cv_sep23.docx
@@ -1,6 +1,6 @@
 
 <file path=word/document.xml><?xml version="1.0" encoding="utf-8"?>
-<w:document xmlns:wpc="http://schemas.microsoft.com/office/word/2010/wordprocessingCanvas" xmlns:cx="http://schemas.microsoft.com/office/drawing/2014/chartex" xmlns:cx1="http://schemas.microsoft.com/office/drawing/2015/9/8/chartex" xmlns:cx2="http://schemas.microsoft.com/office/drawing/2015/10/21/chartex" xmlns:cx3="http://schemas.microsoft.com/office/drawing/2016/5/9/chartex" xmlns:cx4="http://schemas.microsoft.com/office/drawing/2016/5/10/chartex" xmlns:cx5="http://schemas.microsoft.com/office/drawing/2016/5/11/chartex" xmlns:cx6="http://schemas.microsoft.com/office/drawing/2016/5/12/chartex" xmlns:cx7="http://schemas.microsoft.com/office/drawing/2016/5/13/chartex" xmlns:cx8="http://schemas.microsoft.com/office/drawing/2016/5/14/chartex" xmlns:mc="http://schemas.openxmlformats.org/markup-compatibility/2006" xmlns:aink="http://schemas.microsoft.com/office/drawing/2016/ink" xmlns:am3d="http://schemas.microsoft.com/office/drawing/2017/model3d" xmlns:o="urn:schemas-microsoft-com:office:office" xmlns:oel="http://schemas.microsoft.com/office/2019/extlst" xmlns:r="http://schemas.openxmlformats.org/officeDocument/2006/relationships" xmlns:m="http://schemas.openxmlformats.org/officeDocument/2006/math" xmlns:v="urn:schemas-microsoft-com:vml" xmlns:wp14="http://schemas.microsoft.com/office/word/2010/wordprocessingDrawing" xmlns:wp="http://schemas.openxmlformats.org/drawingml/2006/wordprocessingDrawing" xmlns:w10="urn:schemas-microsoft-com:office:word" xmlns:w="http://schemas.openxmlformats.org/wordprocessingml/2006/main" xmlns:w14="http://schemas.microsoft.com/office/word/2010/wordml" xmlns:w15="http://schemas.microsoft.com/office/word/2012/wordml" xmlns:w16cex="http://schemas.microsoft.com/office/word/2018/wordml/cex" xmlns:w16cid="http://schemas.microsoft.com/office/word/2016/wordml/cid" xmlns:w16="http://schemas.microsoft.com/office/word/2018/wordml" xmlns:w16sdtdh="http://schemas.microsoft.com/office/word/2020/wordml/sdtdatahash" xmlns:w16se="http://schemas.microsoft.com/office/word/2015/wordml/symex" xmlns:wpg="http://schemas.microsoft.com/office/word/2010/wordprocessingGroup" xmlns:wpi="http://schemas.microsoft.com/office/word/2010/wordprocessingInk" xmlns:wne="http://schemas.microsoft.com/office/word/2006/wordml" xmlns:wps="http://schemas.microsoft.com/office/word/2010/wordprocessingShape" mc:Ignorable="w14 w15 w16se w16cid w16 w16cex w16sdtdh wp14">
+<w:document xmlns:wpc="http://schemas.microsoft.com/office/word/2010/wordprocessingCanvas" xmlns:cx="http://schemas.microsoft.com/office/drawing/2014/chartex" xmlns:cx1="http://schemas.microsoft.com/office/drawing/2015/9/8/chartex" xmlns:cx2="http://schemas.microsoft.com/office/drawing/2015/10/21/chartex" xmlns:cx3="http://schemas.microsoft.com/office/drawing/2016/5/9/chartex" xmlns:cx4="http://schemas.microsoft.com/office/drawing/2016/5/10/chartex" xmlns:cx5="http://schemas.microsoft.com/office/drawing/2016/5/11/chartex" xmlns:cx6="http://schemas.microsoft.com/office/drawing/2016/5/12/chartex" xmlns:cx7="http://schemas.microsoft.com/office/drawing/2016/5/13/chartex" xmlns:cx8="http://schemas.microsoft.com/office/drawing/2016/5/14/chartex" xmlns:mc="http://schemas.openxmlformats.org/markup-compatibility/2006" xmlns:aink="http://schemas.microsoft.com/office/drawing/2016/ink" xmlns:am3d="http://schemas.microsoft.com/office/drawing/2017/model3d" xmlns:o="urn:schemas-microsoft-com:office:office" xmlns:oel="http://schemas.microsoft.com/office/2019/extlst" xmlns:r="http://schemas.openxmlformats.org/officeDocument/2006/relationships" xmlns:m="http://schemas.openxmlformats.org/officeDocument/2006/math" xmlns:v="urn:schemas-microsoft-com:vml" xmlns:wp14="http://schemas.microsoft.com/office/word/2010/wordprocessingDrawing" xmlns:wp="http://schemas.openxmlformats.org/drawingml/2006/wordprocessingDrawing" xmlns:w10="urn:schemas-microsoft-com:office:word" xmlns:w="http://schemas.openxmlformats.org/wordprocessingml/2006/main" xmlns:w14="http://schemas.microsoft.com/office/word/2010/wordml" xmlns:w15="http://schemas.microsoft.com/office/word/2012/wordml" xmlns:w16cex="http://schemas.microsoft.com/office/word/2018/wordml/cex" xmlns:w16cid="http://schemas.microsoft.com/office/word/2016/wordml/cid" xmlns:w16="http://schemas.microsoft.com/office/word/2018/wordml" xmlns:w16du="http://schemas.microsoft.com/office/word/2023/wordml/word16du" xmlns:w16sdtdh="http://schemas.microsoft.com/office/word/2020/wordml/sdtdatahash" xmlns:w16se="http://schemas.microsoft.com/office/word/2015/wordml/symex" xmlns:wpg="http://schemas.microsoft.com/office/word/2010/wordprocessingGroup" xmlns:wpi="http://schemas.microsoft.com/office/word/2010/wordprocessingInk" xmlns:wne="http://schemas.microsoft.com/office/word/2006/wordml" xmlns:wps="http://schemas.microsoft.com/office/word/2010/wordprocessingShape" mc:Ignorable="w14 w15 w16se w16cid w16 w16cex w16sdtdh w16du wp14">
   <w:body>
     <w:p>
       <w:pPr>
@@ -14,6 +14,7 @@
           <w:szCs w:val="24"/>
         </w:rPr>
       </w:pPr>
+      <w:proofErr w:type="spellStart"/>
       <w:r>
         <w:rPr>
           <w:rFonts w:ascii="Times New Roman" w:eastAsia="Calibri" w:hAnsi="Times New Roman" w:cs="Times New Roman"/>
@@ -21,8 +22,29 @@
           <w:sz w:val="32"/>
           <w:szCs w:val="24"/>
         </w:rPr>
-        <w:t>Shuvom Sadhuka</w:t>
-      </w:r>
+        <w:t>Shuvom</w:t>
+      </w:r>
+      <w:proofErr w:type="spellEnd"/>
+      <w:r>
+        <w:rPr>
+          <w:rFonts w:ascii="Times New Roman" w:eastAsia="Calibri" w:hAnsi="Times New Roman" w:cs="Times New Roman"/>
+          <w:b/>
+          <w:sz w:val="32"/>
+          <w:szCs w:val="24"/>
+        </w:rPr>
+        <w:t xml:space="preserve"> </w:t>
+      </w:r>
+      <w:proofErr w:type="spellStart"/>
+      <w:r>
+        <w:rPr>
+          <w:rFonts w:ascii="Times New Roman" w:eastAsia="Calibri" w:hAnsi="Times New Roman" w:cs="Times New Roman"/>
+          <w:b/>
+          <w:sz w:val="32"/>
+          <w:szCs w:val="24"/>
+        </w:rPr>
+        <w:t>Sadhuka</w:t>
+      </w:r>
+      <w:proofErr w:type="spellEnd"/>
     </w:p>
     <w:p>
       <w:pPr>
@@ -41,7 +63,15 @@
           <w:sz w:val="24"/>
           <w:szCs w:val="24"/>
         </w:rPr>
-        <w:t>Stata Center G572</w:t>
+        <w:t>Stata Center G57</w:t>
+      </w:r>
+      <w:r>
+        <w:rPr>
+          <w:rFonts w:ascii="Times New Roman" w:eastAsia="Calibri" w:hAnsi="Times New Roman" w:cs="Times New Roman"/>
+          <w:sz w:val="24"/>
+          <w:szCs w:val="24"/>
+        </w:rPr>
+        <w:t>2</w:t>
       </w:r>
       <w:r>
         <w:rPr>
@@ -294,27 +324,6 @@
         <w:spacing w:after="0" w:line="240" w:lineRule="auto"/>
         <w:rPr>
           <w:rFonts w:ascii="Times New Roman" w:hAnsi="Times New Roman" w:cs="Times New Roman"/>
-          <w:sz w:val="24"/>
-          <w:szCs w:val="24"/>
-        </w:rPr>
-      </w:pPr>
-      <w:r>
-        <w:rPr>
-          <w:rFonts w:ascii="Times New Roman" w:hAnsi="Times New Roman" w:cs="Times New Roman"/>
-          <w:sz w:val="24"/>
-          <w:szCs w:val="24"/>
-        </w:rPr>
-        <w:t>Advisor: Bonnie Berger</w:t>
-      </w:r>
-    </w:p>
-    <w:p>
-      <w:pPr>
-        <w:autoSpaceDE w:val="0"/>
-        <w:autoSpaceDN w:val="0"/>
-        <w:adjustRightInd w:val="0"/>
-        <w:spacing w:after="0" w:line="240" w:lineRule="auto"/>
-        <w:rPr>
-          <w:rFonts w:ascii="Times New Roman" w:hAnsi="Times New Roman" w:cs="Times New Roman"/>
           <w:i/>
           <w:iCs/>
           <w:sz w:val="24"/>
@@ -337,7 +346,15 @@
           <w:sz w:val="24"/>
           <w:szCs w:val="24"/>
         </w:rPr>
-        <w:t>: Responsible AI, Privacy, Applications to Biomedicine</w:t>
+        <w:t xml:space="preserve">: </w:t>
+      </w:r>
+      <w:r>
+        <w:rPr>
+          <w:rFonts w:ascii="Times New Roman" w:hAnsi="Times New Roman" w:cs="Times New Roman"/>
+          <w:sz w:val="24"/>
+          <w:szCs w:val="24"/>
+        </w:rPr>
+        <w:t>AI and Decision-making, Privacy, Applications to Biomedicine</w:t>
       </w:r>
     </w:p>
     <w:p>
@@ -430,6 +447,15 @@
       <w:r>
         <w:rPr>
           <w:rFonts w:ascii="Times New Roman" w:hAnsi="Times New Roman" w:cs="Times New Roman"/>
+          <w:iCs/>
+          <w:sz w:val="24"/>
+          <w:szCs w:val="24"/>
+        </w:rPr>
+        <w:t xml:space="preserve"> (GPA: 5.0/5.0)</w:t>
+      </w:r>
+      <w:r>
+        <w:rPr>
+          <w:rFonts w:ascii="Times New Roman" w:hAnsi="Times New Roman" w:cs="Times New Roman"/>
           <w:sz w:val="24"/>
           <w:szCs w:val="24"/>
         </w:rPr>
@@ -570,6 +596,15 @@
       <w:r>
         <w:rPr>
           <w:rFonts w:ascii="Times New Roman" w:hAnsi="Times New Roman" w:cs="Times New Roman"/>
+          <w:iCs/>
+          <w:sz w:val="24"/>
+          <w:szCs w:val="24"/>
+        </w:rPr>
+        <w:t xml:space="preserve"> (GPA: 3.9/4.0)</w:t>
+      </w:r>
+      <w:r>
+        <w:rPr>
+          <w:rFonts w:ascii="Times New Roman" w:hAnsi="Times New Roman" w:cs="Times New Roman"/>
           <w:sz w:val="24"/>
           <w:szCs w:val="24"/>
         </w:rPr>
@@ -669,7 +704,7 @@
           <w:sz w:val="24"/>
           <w:szCs w:val="24"/>
         </w:rPr>
-        <w:t xml:space="preserve">PUBLICATIONS  </w:t>
+        <w:t xml:space="preserve">PREPRINTS &amp; </w:t>
       </w:r>
       <w:r>
         <w:rPr>
@@ -678,22 +713,157 @@
           <w:sz w:val="24"/>
           <w:szCs w:val="24"/>
         </w:rPr>
-        <w:tab/>
-      </w:r>
-    </w:p>
-    <w:p>
-      <w:pPr>
-        <w:autoSpaceDE w:val="0"/>
-        <w:autoSpaceDN w:val="0"/>
-        <w:adjustRightInd w:val="0"/>
-        <w:spacing w:after="0" w:line="240" w:lineRule="auto"/>
-        <w:rPr>
-          <w:rFonts w:ascii="Times New Roman" w:hAnsi="Times New Roman" w:cs="Times New Roman"/>
-          <w:bCs/>
-          <w:sz w:val="24"/>
-          <w:szCs w:val="24"/>
-        </w:rPr>
-      </w:pPr>
+        <w:t xml:space="preserve">PUBLICATIONS </w:t>
+      </w:r>
+      <w:r>
+        <w:rPr>
+          <w:rFonts w:ascii="Times New Roman" w:hAnsi="Times New Roman" w:cs="Times New Roman"/>
+          <w:b/>
+          <w:sz w:val="24"/>
+          <w:szCs w:val="24"/>
+        </w:rPr>
+        <w:t>(* denotes equal contribution)</w:t>
+      </w:r>
+    </w:p>
+    <w:p>
+      <w:pPr>
+        <w:autoSpaceDE w:val="0"/>
+        <w:autoSpaceDN w:val="0"/>
+        <w:adjustRightInd w:val="0"/>
+        <w:spacing w:after="0" w:line="240" w:lineRule="auto"/>
+        <w:rPr>
+          <w:rFonts w:ascii="Times New Roman" w:hAnsi="Times New Roman" w:cs="Times New Roman"/>
+          <w:bCs/>
+          <w:sz w:val="24"/>
+          <w:szCs w:val="24"/>
+        </w:rPr>
+      </w:pPr>
+      <w:r>
+        <w:rPr>
+          <w:rFonts w:ascii="Times New Roman" w:hAnsi="Times New Roman" w:cs="Times New Roman"/>
+          <w:bCs/>
+          <w:sz w:val="24"/>
+          <w:szCs w:val="24"/>
+        </w:rPr>
+        <w:t xml:space="preserve">S. </w:t>
+      </w:r>
+      <w:proofErr w:type="spellStart"/>
+      <w:r>
+        <w:rPr>
+          <w:rFonts w:ascii="Times New Roman" w:hAnsi="Times New Roman" w:cs="Times New Roman"/>
+          <w:bCs/>
+          <w:sz w:val="24"/>
+          <w:szCs w:val="24"/>
+        </w:rPr>
+        <w:t>Sadhuka</w:t>
+      </w:r>
+      <w:proofErr w:type="spellEnd"/>
+      <w:r>
+        <w:rPr>
+          <w:rFonts w:ascii="Times New Roman" w:hAnsi="Times New Roman" w:cs="Times New Roman"/>
+          <w:bCs/>
+          <w:sz w:val="24"/>
+          <w:szCs w:val="24"/>
+        </w:rPr>
+        <w:t xml:space="preserve">. S. Lin, B. Berger. E. Pierson. </w:t>
+      </w:r>
+      <w:r>
+        <w:rPr>
+          <w:rFonts w:ascii="Times New Roman" w:hAnsi="Times New Roman" w:cs="Times New Roman"/>
+          <w:bCs/>
+          <w:i/>
+          <w:iCs/>
+          <w:sz w:val="24"/>
+          <w:szCs w:val="24"/>
+        </w:rPr>
+        <w:t>A Bayesian Model for Multi-stage Censoring</w:t>
+      </w:r>
+      <w:r>
+        <w:rPr>
+          <w:rFonts w:ascii="Times New Roman" w:hAnsi="Times New Roman" w:cs="Times New Roman"/>
+          <w:bCs/>
+          <w:sz w:val="24"/>
+          <w:szCs w:val="24"/>
+        </w:rPr>
+        <w:t xml:space="preserve">. Under review 2024. </w:t>
+      </w:r>
+      <w:r>
+        <w:rPr>
+          <w:rFonts w:ascii="Times New Roman" w:hAnsi="Times New Roman" w:cs="Times New Roman"/>
+          <w:bCs/>
+          <w:i/>
+          <w:iCs/>
+          <w:sz w:val="24"/>
+          <w:szCs w:val="24"/>
+        </w:rPr>
+        <w:t>Working paper</w:t>
+      </w:r>
+      <w:r>
+        <w:rPr>
+          <w:rFonts w:ascii="Times New Roman" w:hAnsi="Times New Roman" w:cs="Times New Roman"/>
+          <w:bCs/>
+          <w:sz w:val="24"/>
+          <w:szCs w:val="24"/>
+        </w:rPr>
+        <w:t>.</w:t>
+      </w:r>
+    </w:p>
+    <w:p>
+      <w:pPr>
+        <w:autoSpaceDE w:val="0"/>
+        <w:autoSpaceDN w:val="0"/>
+        <w:adjustRightInd w:val="0"/>
+        <w:spacing w:after="0" w:line="240" w:lineRule="auto"/>
+        <w:rPr>
+          <w:rFonts w:ascii="Times New Roman" w:hAnsi="Times New Roman" w:cs="Times New Roman"/>
+          <w:bCs/>
+          <w:sz w:val="24"/>
+          <w:szCs w:val="24"/>
+        </w:rPr>
+      </w:pPr>
+    </w:p>
+    <w:p>
+      <w:pPr>
+        <w:autoSpaceDE w:val="0"/>
+        <w:autoSpaceDN w:val="0"/>
+        <w:adjustRightInd w:val="0"/>
+        <w:spacing w:after="0" w:line="240" w:lineRule="auto"/>
+        <w:rPr>
+          <w:rFonts w:ascii="Times New Roman" w:hAnsi="Times New Roman" w:cs="Times New Roman"/>
+          <w:bCs/>
+          <w:sz w:val="24"/>
+          <w:szCs w:val="24"/>
+        </w:rPr>
+      </w:pPr>
+      <w:r>
+        <w:rPr>
+          <w:rFonts w:ascii="Times New Roman" w:hAnsi="Times New Roman" w:cs="Times New Roman"/>
+          <w:bCs/>
+          <w:sz w:val="24"/>
+          <w:szCs w:val="24"/>
+        </w:rPr>
+        <w:t xml:space="preserve">S. </w:t>
+      </w:r>
+      <w:proofErr w:type="spellStart"/>
+      <w:r>
+        <w:rPr>
+          <w:rFonts w:ascii="Times New Roman" w:hAnsi="Times New Roman" w:cs="Times New Roman"/>
+          <w:bCs/>
+          <w:sz w:val="24"/>
+          <w:szCs w:val="24"/>
+        </w:rPr>
+        <w:t>Balachandar</w:t>
+      </w:r>
+      <w:proofErr w:type="spellEnd"/>
+      <w:r>
+        <w:rPr>
+          <w:rFonts w:ascii="Times New Roman" w:hAnsi="Times New Roman" w:cs="Times New Roman"/>
+          <w:bCs/>
+          <w:sz w:val="24"/>
+          <w:szCs w:val="24"/>
+        </w:rPr>
+        <w:t xml:space="preserve">, </w:t>
+      </w:r>
       <w:r>
         <w:rPr>
           <w:rFonts w:ascii="Times New Roman" w:hAnsi="Times New Roman" w:cs="Times New Roman"/>
@@ -702,16 +872,28 @@
           <w:szCs w:val="24"/>
           <w:u w:val="single"/>
         </w:rPr>
-        <w:t>S. Sadhuka</w:t>
-      </w:r>
-      <w:r>
-        <w:rPr>
-          <w:rFonts w:ascii="Times New Roman" w:hAnsi="Times New Roman" w:cs="Times New Roman"/>
-          <w:bCs/>
-          <w:sz w:val="24"/>
-          <w:szCs w:val="24"/>
-        </w:rPr>
-        <w:t xml:space="preserve">, D. Fridman, H. Cho, B. Berger. </w:t>
+        <w:t xml:space="preserve">S. </w:t>
+      </w:r>
+      <w:proofErr w:type="spellStart"/>
+      <w:r>
+        <w:rPr>
+          <w:rFonts w:ascii="Times New Roman" w:hAnsi="Times New Roman" w:cs="Times New Roman"/>
+          <w:bCs/>
+          <w:sz w:val="24"/>
+          <w:szCs w:val="24"/>
+          <w:u w:val="single"/>
+        </w:rPr>
+        <w:t>Sadhuka</w:t>
+      </w:r>
+      <w:proofErr w:type="spellEnd"/>
+      <w:r>
+        <w:rPr>
+          <w:rFonts w:ascii="Times New Roman" w:hAnsi="Times New Roman" w:cs="Times New Roman"/>
+          <w:bCs/>
+          <w:sz w:val="24"/>
+          <w:szCs w:val="24"/>
+        </w:rPr>
+        <w:t xml:space="preserve">, B. Berger, E. Pierson, N. Garg. </w:t>
       </w:r>
       <w:r>
         <w:rPr>
@@ -722,6 +904,450 @@
           <w:sz w:val="24"/>
           <w:szCs w:val="24"/>
         </w:rPr>
+        <w:t>Learning graph neural networks from biased outcome data</w:t>
+      </w:r>
+      <w:r>
+        <w:rPr>
+          <w:rFonts w:ascii="Times New Roman" w:hAnsi="Times New Roman" w:cs="Times New Roman"/>
+          <w:bCs/>
+          <w:sz w:val="24"/>
+          <w:szCs w:val="24"/>
+        </w:rPr>
+        <w:t xml:space="preserve">. </w:t>
+      </w:r>
+      <w:r>
+        <w:rPr>
+          <w:rFonts w:ascii="Times New Roman" w:hAnsi="Times New Roman" w:cs="Times New Roman"/>
+          <w:bCs/>
+          <w:i/>
+          <w:iCs/>
+          <w:sz w:val="24"/>
+          <w:szCs w:val="24"/>
+        </w:rPr>
+        <w:t>ICML Workshop on Humans, Algorithmic Decision-Making and Society</w:t>
+      </w:r>
+      <w:r>
+        <w:rPr>
+          <w:rFonts w:ascii="Times New Roman" w:hAnsi="Times New Roman" w:cs="Times New Roman"/>
+          <w:bCs/>
+          <w:sz w:val="24"/>
+          <w:szCs w:val="24"/>
+        </w:rPr>
+        <w:t xml:space="preserve"> 2024. </w:t>
+      </w:r>
+      <w:r>
+        <w:rPr>
+          <w:rFonts w:ascii="Times New Roman" w:hAnsi="Times New Roman" w:cs="Times New Roman"/>
+          <w:bCs/>
+          <w:i/>
+          <w:iCs/>
+          <w:sz w:val="24"/>
+          <w:szCs w:val="24"/>
+        </w:rPr>
+        <w:t>Working paper</w:t>
+      </w:r>
+      <w:r>
+        <w:rPr>
+          <w:rFonts w:ascii="Times New Roman" w:hAnsi="Times New Roman" w:cs="Times New Roman"/>
+          <w:bCs/>
+          <w:sz w:val="24"/>
+          <w:szCs w:val="24"/>
+        </w:rPr>
+        <w:t>.</w:t>
+      </w:r>
+    </w:p>
+    <w:p>
+      <w:pPr>
+        <w:autoSpaceDE w:val="0"/>
+        <w:autoSpaceDN w:val="0"/>
+        <w:adjustRightInd w:val="0"/>
+        <w:spacing w:after="0" w:line="240" w:lineRule="auto"/>
+        <w:rPr>
+          <w:rFonts w:ascii="Times New Roman" w:hAnsi="Times New Roman" w:cs="Times New Roman"/>
+          <w:bCs/>
+          <w:sz w:val="24"/>
+          <w:szCs w:val="24"/>
+        </w:rPr>
+      </w:pPr>
+    </w:p>
+    <w:p>
+      <w:pPr>
+        <w:autoSpaceDE w:val="0"/>
+        <w:autoSpaceDN w:val="0"/>
+        <w:adjustRightInd w:val="0"/>
+        <w:spacing w:after="0" w:line="240" w:lineRule="auto"/>
+        <w:rPr>
+          <w:rFonts w:ascii="Times New Roman" w:hAnsi="Times New Roman" w:cs="Times New Roman"/>
+          <w:bCs/>
+          <w:i/>
+          <w:iCs/>
+          <w:sz w:val="24"/>
+          <w:szCs w:val="24"/>
+        </w:rPr>
+      </w:pPr>
+      <w:r>
+        <w:rPr>
+          <w:rFonts w:ascii="Times New Roman" w:hAnsi="Times New Roman" w:cs="Times New Roman"/>
+          <w:bCs/>
+          <w:sz w:val="24"/>
+          <w:szCs w:val="24"/>
+        </w:rPr>
+        <w:t xml:space="preserve">D. Shanmugam*, </w:t>
+      </w:r>
+      <w:r>
+        <w:rPr>
+          <w:rFonts w:ascii="Times New Roman" w:hAnsi="Times New Roman" w:cs="Times New Roman"/>
+          <w:bCs/>
+          <w:sz w:val="24"/>
+          <w:szCs w:val="24"/>
+          <w:u w:val="single"/>
+        </w:rPr>
+        <w:t xml:space="preserve">S. </w:t>
+      </w:r>
+      <w:proofErr w:type="spellStart"/>
+      <w:r>
+        <w:rPr>
+          <w:rFonts w:ascii="Times New Roman" w:hAnsi="Times New Roman" w:cs="Times New Roman"/>
+          <w:bCs/>
+          <w:sz w:val="24"/>
+          <w:szCs w:val="24"/>
+          <w:u w:val="single"/>
+        </w:rPr>
+        <w:t>Sadhuka</w:t>
+      </w:r>
+      <w:proofErr w:type="spellEnd"/>
+      <w:r>
+        <w:rPr>
+          <w:rFonts w:ascii="Times New Roman" w:hAnsi="Times New Roman" w:cs="Times New Roman"/>
+          <w:bCs/>
+          <w:sz w:val="24"/>
+          <w:szCs w:val="24"/>
+        </w:rPr>
+        <w:t xml:space="preserve">*, M. Raghavan, J. Guttag, B. Berger, E. Pierson. </w:t>
+      </w:r>
+      <w:r>
+        <w:rPr>
+          <w:rFonts w:ascii="Times New Roman" w:hAnsi="Times New Roman" w:cs="Times New Roman"/>
+          <w:bCs/>
+          <w:i/>
+          <w:iCs/>
+          <w:sz w:val="24"/>
+          <w:szCs w:val="24"/>
+        </w:rPr>
+        <w:t>Multi-model Evaluation with Labeled and Unlabeled Data</w:t>
+      </w:r>
+      <w:r>
+        <w:rPr>
+          <w:rFonts w:ascii="Times New Roman" w:hAnsi="Times New Roman" w:cs="Times New Roman"/>
+          <w:bCs/>
+          <w:sz w:val="24"/>
+          <w:szCs w:val="24"/>
+        </w:rPr>
+        <w:t xml:space="preserve">. </w:t>
+      </w:r>
+      <w:r>
+        <w:rPr>
+          <w:rFonts w:ascii="Times New Roman" w:hAnsi="Times New Roman" w:cs="Times New Roman"/>
+          <w:bCs/>
+          <w:i/>
+          <w:iCs/>
+          <w:sz w:val="24"/>
+          <w:szCs w:val="24"/>
+        </w:rPr>
+        <w:t xml:space="preserve">ICLR Workshop on Data-Centric Machine Learning Research </w:t>
+      </w:r>
+      <w:r>
+        <w:rPr>
+          <w:rFonts w:ascii="Times New Roman" w:hAnsi="Times New Roman" w:cs="Times New Roman"/>
+          <w:bCs/>
+          <w:sz w:val="24"/>
+          <w:szCs w:val="24"/>
+        </w:rPr>
+        <w:t>2024</w:t>
+      </w:r>
+      <w:r>
+        <w:rPr>
+          <w:rFonts w:ascii="Times New Roman" w:hAnsi="Times New Roman" w:cs="Times New Roman"/>
+          <w:bCs/>
+          <w:sz w:val="24"/>
+          <w:szCs w:val="24"/>
+        </w:rPr>
+        <w:t>.</w:t>
+      </w:r>
+      <w:r>
+        <w:rPr>
+          <w:rFonts w:ascii="Times New Roman" w:hAnsi="Times New Roman" w:cs="Times New Roman"/>
+          <w:bCs/>
+          <w:sz w:val="24"/>
+          <w:szCs w:val="24"/>
+        </w:rPr>
+        <w:t xml:space="preserve"> </w:t>
+      </w:r>
+      <w:r>
+        <w:rPr>
+          <w:rFonts w:ascii="Times New Roman" w:hAnsi="Times New Roman" w:cs="Times New Roman"/>
+          <w:bCs/>
+          <w:i/>
+          <w:iCs/>
+          <w:sz w:val="24"/>
+          <w:szCs w:val="24"/>
+        </w:rPr>
+        <w:t>Working paper.</w:t>
+      </w:r>
+    </w:p>
+    <w:p>
+      <w:pPr>
+        <w:autoSpaceDE w:val="0"/>
+        <w:autoSpaceDN w:val="0"/>
+        <w:adjustRightInd w:val="0"/>
+        <w:spacing w:after="0" w:line="240" w:lineRule="auto"/>
+        <w:rPr>
+          <w:rFonts w:ascii="Times New Roman" w:hAnsi="Times New Roman" w:cs="Times New Roman"/>
+          <w:bCs/>
+          <w:sz w:val="24"/>
+          <w:szCs w:val="24"/>
+        </w:rPr>
+      </w:pPr>
+    </w:p>
+    <w:p>
+      <w:pPr>
+        <w:autoSpaceDE w:val="0"/>
+        <w:autoSpaceDN w:val="0"/>
+        <w:adjustRightInd w:val="0"/>
+        <w:spacing w:after="0" w:line="240" w:lineRule="auto"/>
+        <w:rPr>
+          <w:rFonts w:ascii="Times New Roman" w:hAnsi="Times New Roman" w:cs="Times New Roman"/>
+          <w:bCs/>
+          <w:sz w:val="24"/>
+          <w:szCs w:val="24"/>
+        </w:rPr>
+      </w:pPr>
+      <w:r>
+        <w:rPr>
+          <w:rFonts w:ascii="Times New Roman" w:hAnsi="Times New Roman" w:cs="Times New Roman"/>
+          <w:bCs/>
+          <w:sz w:val="24"/>
+          <w:szCs w:val="24"/>
+        </w:rPr>
+        <w:t xml:space="preserve">H. Cho, D. </w:t>
+      </w:r>
+      <w:proofErr w:type="spellStart"/>
+      <w:r>
+        <w:rPr>
+          <w:rFonts w:ascii="Times New Roman" w:hAnsi="Times New Roman" w:cs="Times New Roman"/>
+          <w:bCs/>
+          <w:sz w:val="24"/>
+          <w:szCs w:val="24"/>
+        </w:rPr>
+        <w:t>Froelicher</w:t>
+      </w:r>
+      <w:proofErr w:type="spellEnd"/>
+      <w:r>
+        <w:rPr>
+          <w:rFonts w:ascii="Times New Roman" w:hAnsi="Times New Roman" w:cs="Times New Roman"/>
+          <w:bCs/>
+          <w:sz w:val="24"/>
+          <w:szCs w:val="24"/>
+        </w:rPr>
+        <w:t xml:space="preserve">*, N. </w:t>
+      </w:r>
+      <w:proofErr w:type="spellStart"/>
+      <w:r>
+        <w:rPr>
+          <w:rFonts w:ascii="Times New Roman" w:hAnsi="Times New Roman" w:cs="Times New Roman"/>
+          <w:bCs/>
+          <w:sz w:val="24"/>
+          <w:szCs w:val="24"/>
+        </w:rPr>
+        <w:t>Dokmai</w:t>
+      </w:r>
+      <w:proofErr w:type="spellEnd"/>
+      <w:r>
+        <w:rPr>
+          <w:rFonts w:ascii="Times New Roman" w:hAnsi="Times New Roman" w:cs="Times New Roman"/>
+          <w:bCs/>
+          <w:sz w:val="24"/>
+          <w:szCs w:val="24"/>
+        </w:rPr>
+        <w:t xml:space="preserve">*, A. Nandi*, </w:t>
+      </w:r>
+      <w:r>
+        <w:rPr>
+          <w:rFonts w:ascii="Times New Roman" w:hAnsi="Times New Roman" w:cs="Times New Roman"/>
+          <w:bCs/>
+          <w:sz w:val="24"/>
+          <w:szCs w:val="24"/>
+          <w:u w:val="single"/>
+        </w:rPr>
+        <w:t xml:space="preserve">S. </w:t>
+      </w:r>
+      <w:proofErr w:type="spellStart"/>
+      <w:r>
+        <w:rPr>
+          <w:rFonts w:ascii="Times New Roman" w:hAnsi="Times New Roman" w:cs="Times New Roman"/>
+          <w:bCs/>
+          <w:sz w:val="24"/>
+          <w:szCs w:val="24"/>
+          <w:u w:val="single"/>
+        </w:rPr>
+        <w:t>Sadhuka</w:t>
+      </w:r>
+      <w:proofErr w:type="spellEnd"/>
+      <w:r>
+        <w:rPr>
+          <w:rFonts w:ascii="Times New Roman" w:hAnsi="Times New Roman" w:cs="Times New Roman"/>
+          <w:bCs/>
+          <w:sz w:val="24"/>
+          <w:szCs w:val="24"/>
+        </w:rPr>
+        <w:t xml:space="preserve">*, </w:t>
+      </w:r>
+      <w:r>
+        <w:rPr>
+          <w:rFonts w:ascii="Times New Roman" w:hAnsi="Times New Roman" w:cs="Times New Roman"/>
+          <w:bCs/>
+          <w:sz w:val="24"/>
+          <w:szCs w:val="24"/>
+        </w:rPr>
+        <w:t>M. Hong*, B. Berger</w:t>
+      </w:r>
+      <w:r>
+        <w:rPr>
+          <w:rFonts w:ascii="Times New Roman" w:hAnsi="Times New Roman" w:cs="Times New Roman"/>
+          <w:bCs/>
+          <w:sz w:val="24"/>
+          <w:szCs w:val="24"/>
+        </w:rPr>
+        <w:t xml:space="preserve">. </w:t>
+      </w:r>
+      <w:r>
+        <w:rPr>
+          <w:rFonts w:ascii="Times New Roman" w:hAnsi="Times New Roman" w:cs="Times New Roman"/>
+          <w:bCs/>
+          <w:i/>
+          <w:iCs/>
+          <w:sz w:val="24"/>
+          <w:szCs w:val="24"/>
+        </w:rPr>
+        <w:t>Privacy-Enhancing Technologies in Biomedical Data Science</w:t>
+      </w:r>
+      <w:r>
+        <w:rPr>
+          <w:rFonts w:ascii="Times New Roman" w:hAnsi="Times New Roman" w:cs="Times New Roman"/>
+          <w:bCs/>
+          <w:sz w:val="24"/>
+          <w:szCs w:val="24"/>
+        </w:rPr>
+        <w:t xml:space="preserve">. In press at </w:t>
+      </w:r>
+      <w:r>
+        <w:rPr>
+          <w:rFonts w:ascii="Times New Roman" w:hAnsi="Times New Roman" w:cs="Times New Roman"/>
+          <w:bCs/>
+          <w:i/>
+          <w:iCs/>
+          <w:sz w:val="24"/>
+          <w:szCs w:val="24"/>
+        </w:rPr>
+        <w:t xml:space="preserve">Annual Reviews in Biomedical Data Science </w:t>
+      </w:r>
+      <w:r>
+        <w:rPr>
+          <w:rFonts w:ascii="Times New Roman" w:hAnsi="Times New Roman" w:cs="Times New Roman"/>
+          <w:bCs/>
+          <w:sz w:val="24"/>
+          <w:szCs w:val="24"/>
+        </w:rPr>
+        <w:t>2024.</w:t>
+      </w:r>
+    </w:p>
+    <w:p>
+      <w:pPr>
+        <w:autoSpaceDE w:val="0"/>
+        <w:autoSpaceDN w:val="0"/>
+        <w:adjustRightInd w:val="0"/>
+        <w:spacing w:after="0" w:line="240" w:lineRule="auto"/>
+        <w:rPr>
+          <w:rFonts w:ascii="Times New Roman" w:hAnsi="Times New Roman" w:cs="Times New Roman"/>
+          <w:bCs/>
+          <w:sz w:val="24"/>
+          <w:szCs w:val="24"/>
+        </w:rPr>
+      </w:pPr>
+    </w:p>
+    <w:p>
+      <w:pPr>
+        <w:autoSpaceDE w:val="0"/>
+        <w:autoSpaceDN w:val="0"/>
+        <w:adjustRightInd w:val="0"/>
+        <w:spacing w:after="0" w:line="240" w:lineRule="auto"/>
+        <w:rPr>
+          <w:rFonts w:ascii="Times New Roman" w:hAnsi="Times New Roman" w:cs="Times New Roman"/>
+          <w:bCs/>
+          <w:sz w:val="24"/>
+          <w:szCs w:val="24"/>
+        </w:rPr>
+      </w:pPr>
+      <w:r>
+        <w:rPr>
+          <w:rFonts w:ascii="Times New Roman" w:hAnsi="Times New Roman" w:cs="Times New Roman"/>
+          <w:bCs/>
+          <w:sz w:val="24"/>
+          <w:szCs w:val="24"/>
+          <w:u w:val="single"/>
+        </w:rPr>
+        <w:t xml:space="preserve">S. </w:t>
+      </w:r>
+      <w:proofErr w:type="spellStart"/>
+      <w:r>
+        <w:rPr>
+          <w:rFonts w:ascii="Times New Roman" w:hAnsi="Times New Roman" w:cs="Times New Roman"/>
+          <w:bCs/>
+          <w:sz w:val="24"/>
+          <w:szCs w:val="24"/>
+          <w:u w:val="single"/>
+        </w:rPr>
+        <w:t>Sadhuka</w:t>
+      </w:r>
+      <w:proofErr w:type="spellEnd"/>
+      <w:r>
+        <w:rPr>
+          <w:rFonts w:ascii="Times New Roman" w:hAnsi="Times New Roman" w:cs="Times New Roman"/>
+          <w:bCs/>
+          <w:sz w:val="24"/>
+          <w:szCs w:val="24"/>
+        </w:rPr>
+        <w:t xml:space="preserve">, D. </w:t>
+      </w:r>
+      <w:proofErr w:type="spellStart"/>
+      <w:r>
+        <w:rPr>
+          <w:rFonts w:ascii="Times New Roman" w:hAnsi="Times New Roman" w:cs="Times New Roman"/>
+          <w:bCs/>
+          <w:sz w:val="24"/>
+          <w:szCs w:val="24"/>
+        </w:rPr>
+        <w:t>Fridman</w:t>
+      </w:r>
+      <w:proofErr w:type="spellEnd"/>
+      <w:r>
+        <w:rPr>
+          <w:rFonts w:ascii="Times New Roman" w:hAnsi="Times New Roman" w:cs="Times New Roman"/>
+          <w:bCs/>
+          <w:sz w:val="24"/>
+          <w:szCs w:val="24"/>
+        </w:rPr>
+        <w:t xml:space="preserve">, H. Cho, B. Berger. </w:t>
+      </w:r>
+      <w:r>
+        <w:rPr>
+          <w:rFonts w:ascii="Times New Roman" w:hAnsi="Times New Roman" w:cs="Times New Roman"/>
+          <w:bCs/>
+          <w:i/>
+          <w:iCs/>
+          <w:sz w:val="24"/>
+          <w:szCs w:val="24"/>
+        </w:rPr>
         <w:t>Assessing transcriptomic reidentification risks using discriminative sequence models</w:t>
       </w:r>
       <w:r>
@@ -816,8 +1442,20 @@
           <w:szCs w:val="24"/>
           <w:u w:val="single"/>
         </w:rPr>
-        <w:t>S. Sadhuka</w:t>
-      </w:r>
+        <w:t xml:space="preserve">S. </w:t>
+      </w:r>
+      <w:proofErr w:type="spellStart"/>
+      <w:r>
+        <w:rPr>
+          <w:rFonts w:ascii="Times New Roman" w:hAnsi="Times New Roman" w:cs="Times New Roman"/>
+          <w:bCs/>
+          <w:sz w:val="24"/>
+          <w:szCs w:val="24"/>
+          <w:u w:val="single"/>
+        </w:rPr>
+        <w:t>Sadhuka</w:t>
+      </w:r>
+      <w:proofErr w:type="spellEnd"/>
       <w:r>
         <w:rPr>
           <w:rFonts w:ascii="Times New Roman" w:hAnsi="Times New Roman" w:cs="Times New Roman"/>
@@ -838,6 +1476,7 @@
         </w:rPr>
         <w:t xml:space="preserve">Topological </w:t>
       </w:r>
+      <w:proofErr w:type="spellStart"/>
       <w:r>
         <w:rPr>
           <w:rFonts w:ascii="Times New Roman" w:hAnsi="Times New Roman" w:cs="Times New Roman"/>
@@ -858,7 +1497,19 @@
           <w:sz w:val="24"/>
           <w:szCs w:val="24"/>
         </w:rPr>
-        <w:t xml:space="preserve">hononic </w:t>
+        <w:t>hononic</w:t>
+      </w:r>
+      <w:proofErr w:type="spellEnd"/>
+      <w:r>
+        <w:rPr>
+          <w:rFonts w:ascii="Times New Roman" w:hAnsi="Times New Roman" w:cs="Times New Roman"/>
+          <w:bCs/>
+          <w:i/>
+          <w:iCs/>
+          <w:sz w:val="24"/>
+          <w:szCs w:val="24"/>
+        </w:rPr>
+        <w:t xml:space="preserve"> </w:t>
       </w:r>
       <w:r>
         <w:rPr>
@@ -1017,6 +1668,7 @@
         <w:t xml:space="preserve">, </w:t>
       </w:r>
       <w:hyperlink r:id="rId12" w:history="1">
+        <w:proofErr w:type="spellStart"/>
         <w:r>
           <w:rPr>
             <w:rStyle w:val="Hyperlink"/>
@@ -1029,6 +1681,7 @@
           </w:rPr>
           <w:t>Hackaday</w:t>
         </w:r>
+        <w:proofErr w:type="spellEnd"/>
       </w:hyperlink>
     </w:p>
     <w:p>
@@ -1065,7 +1718,28 @@
           <w:sz w:val="24"/>
           <w:szCs w:val="24"/>
         </w:rPr>
-        <w:t xml:space="preserve">Q. Wang, D. Kelley, J. Ulrisch, M. Kanai, </w:t>
+        <w:lastRenderedPageBreak/>
+        <w:t xml:space="preserve">Q. Wang, D. Kelley, J. </w:t>
+      </w:r>
+      <w:proofErr w:type="spellStart"/>
+      <w:r>
+        <w:rPr>
+          <w:rFonts w:ascii="Times New Roman" w:hAnsi="Times New Roman" w:cs="Times New Roman"/>
+          <w:bCs/>
+          <w:sz w:val="24"/>
+          <w:szCs w:val="24"/>
+        </w:rPr>
+        <w:t>Ulrisch</w:t>
+      </w:r>
+      <w:proofErr w:type="spellEnd"/>
+      <w:r>
+        <w:rPr>
+          <w:rFonts w:ascii="Times New Roman" w:hAnsi="Times New Roman" w:cs="Times New Roman"/>
+          <w:bCs/>
+          <w:sz w:val="24"/>
+          <w:szCs w:val="24"/>
+        </w:rPr>
+        <w:t xml:space="preserve">, M. Kanai, </w:t>
       </w:r>
       <w:r>
         <w:rPr>
@@ -1075,16 +1749,88 @@
           <w:szCs w:val="24"/>
           <w:u w:val="single"/>
         </w:rPr>
-        <w:t>S. Sadhuka</w:t>
-      </w:r>
-      <w:r>
-        <w:rPr>
-          <w:rFonts w:ascii="Times New Roman" w:hAnsi="Times New Roman" w:cs="Times New Roman"/>
-          <w:bCs/>
-          <w:sz w:val="24"/>
-          <w:szCs w:val="24"/>
-        </w:rPr>
-        <w:t xml:space="preserve">, R. Cui, C. Albors, N. Cheng, Y. Okada, Biobank Japan Project, F. Aguet, K. Ardlie, D. MacArthur, H. Finucane. </w:t>
+        <w:t xml:space="preserve">S. </w:t>
+      </w:r>
+      <w:proofErr w:type="spellStart"/>
+      <w:r>
+        <w:rPr>
+          <w:rFonts w:ascii="Times New Roman" w:hAnsi="Times New Roman" w:cs="Times New Roman"/>
+          <w:bCs/>
+          <w:sz w:val="24"/>
+          <w:szCs w:val="24"/>
+          <w:u w:val="single"/>
+        </w:rPr>
+        <w:t>Sadhuka</w:t>
+      </w:r>
+      <w:proofErr w:type="spellEnd"/>
+      <w:r>
+        <w:rPr>
+          <w:rFonts w:ascii="Times New Roman" w:hAnsi="Times New Roman" w:cs="Times New Roman"/>
+          <w:bCs/>
+          <w:sz w:val="24"/>
+          <w:szCs w:val="24"/>
+        </w:rPr>
+        <w:t xml:space="preserve">, R. Cui, C. </w:t>
+      </w:r>
+      <w:proofErr w:type="spellStart"/>
+      <w:r>
+        <w:rPr>
+          <w:rFonts w:ascii="Times New Roman" w:hAnsi="Times New Roman" w:cs="Times New Roman"/>
+          <w:bCs/>
+          <w:sz w:val="24"/>
+          <w:szCs w:val="24"/>
+        </w:rPr>
+        <w:t>Albors</w:t>
+      </w:r>
+      <w:proofErr w:type="spellEnd"/>
+      <w:r>
+        <w:rPr>
+          <w:rFonts w:ascii="Times New Roman" w:hAnsi="Times New Roman" w:cs="Times New Roman"/>
+          <w:bCs/>
+          <w:sz w:val="24"/>
+          <w:szCs w:val="24"/>
+        </w:rPr>
+        <w:t xml:space="preserve">, N. Cheng, Y. Okada, Biobank Japan Project, F. </w:t>
+      </w:r>
+      <w:proofErr w:type="spellStart"/>
+      <w:r>
+        <w:rPr>
+          <w:rFonts w:ascii="Times New Roman" w:hAnsi="Times New Roman" w:cs="Times New Roman"/>
+          <w:bCs/>
+          <w:sz w:val="24"/>
+          <w:szCs w:val="24"/>
+        </w:rPr>
+        <w:t>Aguet</w:t>
+      </w:r>
+      <w:proofErr w:type="spellEnd"/>
+      <w:r>
+        <w:rPr>
+          <w:rFonts w:ascii="Times New Roman" w:hAnsi="Times New Roman" w:cs="Times New Roman"/>
+          <w:bCs/>
+          <w:sz w:val="24"/>
+          <w:szCs w:val="24"/>
+        </w:rPr>
+        <w:t xml:space="preserve">, K. </w:t>
+      </w:r>
+      <w:proofErr w:type="spellStart"/>
+      <w:r>
+        <w:rPr>
+          <w:rFonts w:ascii="Times New Roman" w:hAnsi="Times New Roman" w:cs="Times New Roman"/>
+          <w:bCs/>
+          <w:sz w:val="24"/>
+          <w:szCs w:val="24"/>
+        </w:rPr>
+        <w:t>Ardlie</w:t>
+      </w:r>
+      <w:proofErr w:type="spellEnd"/>
+      <w:r>
+        <w:rPr>
+          <w:rFonts w:ascii="Times New Roman" w:hAnsi="Times New Roman" w:cs="Times New Roman"/>
+          <w:bCs/>
+          <w:sz w:val="24"/>
+          <w:szCs w:val="24"/>
+        </w:rPr>
+        <w:t xml:space="preserve">, D. MacArthur, H. Finucane. </w:t>
       </w:r>
       <w:r>
         <w:rPr>
@@ -1095,7 +1841,55 @@
           <w:sz w:val="24"/>
           <w:szCs w:val="24"/>
         </w:rPr>
-        <w:t>Leveraging supervised learning for functionally informed fine-mapping of cis-eQTLs identifies an additional 20,913 putative causal eQTLs. Nature Communications</w:t>
+        <w:t>Leveraging supervised learning for functionally informed fine-mapping of cis-</w:t>
+      </w:r>
+      <w:proofErr w:type="spellStart"/>
+      <w:r>
+        <w:rPr>
+          <w:rFonts w:ascii="Times New Roman" w:hAnsi="Times New Roman" w:cs="Times New Roman"/>
+          <w:bCs/>
+          <w:i/>
+          <w:iCs/>
+          <w:sz w:val="24"/>
+          <w:szCs w:val="24"/>
+        </w:rPr>
+        <w:t>eQTLs</w:t>
+      </w:r>
+      <w:proofErr w:type="spellEnd"/>
+      <w:r>
+        <w:rPr>
+          <w:rFonts w:ascii="Times New Roman" w:hAnsi="Times New Roman" w:cs="Times New Roman"/>
+          <w:bCs/>
+          <w:i/>
+          <w:iCs/>
+          <w:sz w:val="24"/>
+          <w:szCs w:val="24"/>
+        </w:rPr>
+        <w:t xml:space="preserve"> identifies an additional 20,913 putative causal </w:t>
+      </w:r>
+      <w:proofErr w:type="spellStart"/>
+      <w:r>
+        <w:rPr>
+          <w:rFonts w:ascii="Times New Roman" w:hAnsi="Times New Roman" w:cs="Times New Roman"/>
+          <w:bCs/>
+          <w:i/>
+          <w:iCs/>
+          <w:sz w:val="24"/>
+          <w:szCs w:val="24"/>
+        </w:rPr>
+        <w:t>eQTLs</w:t>
+      </w:r>
+      <w:proofErr w:type="spellEnd"/>
+      <w:r>
+        <w:rPr>
+          <w:rFonts w:ascii="Times New Roman" w:hAnsi="Times New Roman" w:cs="Times New Roman"/>
+          <w:bCs/>
+          <w:i/>
+          <w:iCs/>
+          <w:sz w:val="24"/>
+          <w:szCs w:val="24"/>
+        </w:rPr>
+        <w:t>. Nature Communications</w:t>
       </w:r>
       <w:r>
         <w:rPr>
@@ -1141,7 +1935,7 @@
           <w:sz w:val="24"/>
           <w:szCs w:val="24"/>
         </w:rPr>
-        <w:t>LECTURES</w:t>
+        <w:t>TALKS</w:t>
       </w:r>
       <w:r>
         <w:rPr>
@@ -1150,7 +1944,34 @@
           <w:sz w:val="24"/>
           <w:szCs w:val="24"/>
         </w:rPr>
-        <w:t xml:space="preserve"> AND PRESENTATIONS</w:t>
+        <w:t xml:space="preserve"> </w:t>
+      </w:r>
+      <w:r>
+        <w:rPr>
+          <w:rFonts w:ascii="Times New Roman" w:hAnsi="Times New Roman" w:cs="Times New Roman"/>
+          <w:b/>
+          <w:sz w:val="24"/>
+          <w:szCs w:val="24"/>
+        </w:rPr>
+        <w:t>&amp;</w:t>
+      </w:r>
+      <w:r>
+        <w:rPr>
+          <w:rFonts w:ascii="Times New Roman" w:hAnsi="Times New Roman" w:cs="Times New Roman"/>
+          <w:b/>
+          <w:sz w:val="24"/>
+          <w:szCs w:val="24"/>
+        </w:rPr>
+        <w:t xml:space="preserve"> </w:t>
+      </w:r>
+      <w:r>
+        <w:rPr>
+          <w:rFonts w:ascii="Times New Roman" w:hAnsi="Times New Roman" w:cs="Times New Roman"/>
+          <w:b/>
+          <w:sz w:val="24"/>
+          <w:szCs w:val="24"/>
+        </w:rPr>
+        <w:t>POSTERS</w:t>
       </w:r>
     </w:p>
     <w:p>
@@ -1164,7 +1985,6 @@
         <w:spacing w:after="0" w:line="240" w:lineRule="auto"/>
         <w:rPr>
           <w:rFonts w:ascii="Times New Roman" w:hAnsi="Times New Roman" w:cs="Times New Roman"/>
-          <w:iCs/>
           <w:sz w:val="24"/>
           <w:szCs w:val="24"/>
         </w:rPr>
@@ -1177,6 +1997,59 @@
           <w:sz w:val="24"/>
           <w:szCs w:val="24"/>
         </w:rPr>
+        <w:t>ACM Conference on Health, Inference, and Learning</w:t>
+      </w:r>
+      <w:r>
+        <w:rPr>
+          <w:rFonts w:ascii="Times New Roman" w:hAnsi="Times New Roman" w:cs="Times New Roman"/>
+          <w:sz w:val="24"/>
+          <w:szCs w:val="24"/>
+        </w:rPr>
+        <w:t>. New York, NY [</w:t>
+      </w:r>
+      <w:proofErr w:type="gramStart"/>
+      <w:r>
+        <w:rPr>
+          <w:rFonts w:ascii="Times New Roman" w:hAnsi="Times New Roman" w:cs="Times New Roman"/>
+          <w:sz w:val="24"/>
+          <w:szCs w:val="24"/>
+        </w:rPr>
+        <w:t xml:space="preserve">Poster]   </w:t>
+      </w:r>
+      <w:proofErr w:type="gramEnd"/>
+      <w:r>
+        <w:rPr>
+          <w:rFonts w:ascii="Times New Roman" w:hAnsi="Times New Roman" w:cs="Times New Roman"/>
+          <w:sz w:val="24"/>
+          <w:szCs w:val="24"/>
+        </w:rPr>
+        <w:t xml:space="preserve">                   2024</w:t>
+      </w:r>
+    </w:p>
+    <w:p>
+      <w:pPr>
+        <w:tabs>
+          <w:tab w:val="right" w:pos="9360"/>
+        </w:tabs>
+        <w:autoSpaceDE w:val="0"/>
+        <w:autoSpaceDN w:val="0"/>
+        <w:adjustRightInd w:val="0"/>
+        <w:spacing w:after="0" w:line="240" w:lineRule="auto"/>
+        <w:rPr>
+          <w:rFonts w:ascii="Times New Roman" w:hAnsi="Times New Roman" w:cs="Times New Roman"/>
+          <w:iCs/>
+          <w:sz w:val="24"/>
+          <w:szCs w:val="24"/>
+        </w:rPr>
+      </w:pPr>
+      <w:r>
+        <w:rPr>
+          <w:rFonts w:ascii="Times New Roman" w:hAnsi="Times New Roman" w:cs="Times New Roman"/>
+          <w:i/>
+          <w:iCs/>
+          <w:sz w:val="24"/>
+          <w:szCs w:val="24"/>
+        </w:rPr>
         <w:t>Research in Computational Molecular Biology</w:t>
       </w:r>
       <w:r>
@@ -1186,6 +2059,14 @@
           <w:szCs w:val="24"/>
         </w:rPr>
         <w:t>. Istanbul, Turkey</w:t>
+      </w:r>
+      <w:r>
+        <w:rPr>
+          <w:rFonts w:ascii="Times New Roman" w:hAnsi="Times New Roman" w:cs="Times New Roman"/>
+          <w:sz w:val="24"/>
+          <w:szCs w:val="24"/>
+        </w:rPr>
+        <w:t xml:space="preserve"> [Talk]</w:t>
       </w:r>
       <w:r>
         <w:rPr>
@@ -1289,6 +2170,15 @@
           <w:sz w:val="24"/>
           <w:szCs w:val="24"/>
         </w:rPr>
+        <w:t xml:space="preserve"> [Talk]</w:t>
+      </w:r>
+      <w:r>
+        <w:rPr>
+          <w:rFonts w:ascii="Times New Roman" w:hAnsi="Times New Roman" w:cs="Times New Roman"/>
+          <w:iCs/>
+          <w:sz w:val="24"/>
+          <w:szCs w:val="24"/>
+        </w:rPr>
         <w:tab/>
         <w:t>2021</w:t>
       </w:r>
@@ -1326,6 +2216,15 @@
           <w:szCs w:val="24"/>
         </w:rPr>
         <w:t>. Virtual</w:t>
+      </w:r>
+      <w:r>
+        <w:rPr>
+          <w:rFonts w:ascii="Times New Roman" w:hAnsi="Times New Roman" w:cs="Times New Roman"/>
+          <w:iCs/>
+          <w:sz w:val="24"/>
+          <w:szCs w:val="24"/>
+        </w:rPr>
+        <w:t xml:space="preserve"> [Talk]</w:t>
       </w:r>
       <w:r>
         <w:rPr>
@@ -1406,7 +2305,7 @@
           <w:sz w:val="24"/>
           <w:szCs w:val="24"/>
         </w:rPr>
-        <w:t>MIT Schwarzmann College of Computing SERC Essay Prize, Honorable Mention</w:t>
+        <w:t>MIT Schwarzman College of Computing SERC Essay Prize, Honorable Mention</w:t>
       </w:r>
       <w:r>
         <w:rPr>
@@ -1441,6 +2340,159 @@
           <w:szCs w:val="24"/>
         </w:rPr>
         <w:t>23</w:t>
+      </w:r>
+    </w:p>
+    <w:p>
+      <w:pPr>
+        <w:tabs>
+          <w:tab w:val="right" w:pos="9360"/>
+        </w:tabs>
+        <w:autoSpaceDE w:val="0"/>
+        <w:autoSpaceDN w:val="0"/>
+        <w:adjustRightInd w:val="0"/>
+        <w:spacing w:after="0" w:line="240" w:lineRule="auto"/>
+        <w:rPr>
+          <w:rFonts w:ascii="Times New Roman" w:hAnsi="Times New Roman" w:cs="Times New Roman"/>
+          <w:iCs/>
+          <w:sz w:val="24"/>
+          <w:szCs w:val="24"/>
+        </w:rPr>
+      </w:pPr>
+      <w:r>
+        <w:rPr>
+          <w:rFonts w:ascii="Times New Roman" w:hAnsi="Times New Roman" w:cs="Times New Roman"/>
+          <w:sz w:val="24"/>
+          <w:szCs w:val="24"/>
+        </w:rPr>
+        <w:t>RECOMB Travel Fellowship</w:t>
+      </w:r>
+      <w:r>
+        <w:rPr>
+          <w:rFonts w:ascii="Times New Roman" w:hAnsi="Times New Roman" w:cs="Times New Roman"/>
+          <w:sz w:val="24"/>
+          <w:szCs w:val="24"/>
+        </w:rPr>
+        <w:tab/>
+      </w:r>
+      <w:r>
+        <w:rPr>
+          <w:rFonts w:ascii="Times New Roman" w:hAnsi="Times New Roman" w:cs="Times New Roman"/>
+          <w:iCs/>
+          <w:sz w:val="24"/>
+          <w:szCs w:val="24"/>
+        </w:rPr>
+        <w:t>20</w:t>
+      </w:r>
+      <w:r>
+        <w:rPr>
+          <w:rFonts w:ascii="Times New Roman" w:hAnsi="Times New Roman" w:cs="Times New Roman"/>
+          <w:iCs/>
+          <w:sz w:val="24"/>
+          <w:szCs w:val="24"/>
+        </w:rPr>
+        <w:t>23</w:t>
+      </w:r>
+    </w:p>
+    <w:p>
+      <w:pPr>
+        <w:tabs>
+          <w:tab w:val="right" w:pos="9360"/>
+        </w:tabs>
+        <w:autoSpaceDE w:val="0"/>
+        <w:autoSpaceDN w:val="0"/>
+        <w:adjustRightInd w:val="0"/>
+        <w:spacing w:after="0" w:line="240" w:lineRule="auto"/>
+        <w:rPr>
+          <w:rFonts w:ascii="Times New Roman" w:hAnsi="Times New Roman" w:cs="Times New Roman"/>
+          <w:iCs/>
+          <w:sz w:val="24"/>
+          <w:szCs w:val="24"/>
+        </w:rPr>
+      </w:pPr>
+      <w:r>
+        <w:rPr>
+          <w:rFonts w:ascii="Times New Roman" w:hAnsi="Times New Roman" w:cs="Times New Roman"/>
+          <w:sz w:val="24"/>
+          <w:szCs w:val="24"/>
+        </w:rPr>
+        <w:t>National Science Foundation Graduate Research Fellowship</w:t>
+      </w:r>
+      <w:r>
+        <w:rPr>
+          <w:rFonts w:ascii="Times New Roman" w:hAnsi="Times New Roman" w:cs="Times New Roman"/>
+          <w:sz w:val="24"/>
+          <w:szCs w:val="24"/>
+        </w:rPr>
+        <w:tab/>
+      </w:r>
+      <w:r>
+        <w:rPr>
+          <w:rFonts w:ascii="Times New Roman" w:hAnsi="Times New Roman" w:cs="Times New Roman"/>
+          <w:iCs/>
+          <w:sz w:val="24"/>
+          <w:szCs w:val="24"/>
+        </w:rPr>
+        <w:t>20</w:t>
+      </w:r>
+      <w:r>
+        <w:rPr>
+          <w:rFonts w:ascii="Times New Roman" w:hAnsi="Times New Roman" w:cs="Times New Roman"/>
+          <w:iCs/>
+          <w:sz w:val="24"/>
+          <w:szCs w:val="24"/>
+        </w:rPr>
+        <w:t>22</w:t>
+      </w:r>
+    </w:p>
+    <w:p>
+      <w:pPr>
+        <w:tabs>
+          <w:tab w:val="right" w:pos="9360"/>
+        </w:tabs>
+        <w:autoSpaceDE w:val="0"/>
+        <w:autoSpaceDN w:val="0"/>
+        <w:adjustRightInd w:val="0"/>
+        <w:spacing w:after="0" w:line="240" w:lineRule="auto"/>
+        <w:rPr>
+          <w:rFonts w:ascii="Times New Roman" w:hAnsi="Times New Roman" w:cs="Times New Roman"/>
+          <w:iCs/>
+          <w:sz w:val="24"/>
+          <w:szCs w:val="24"/>
+        </w:rPr>
+      </w:pPr>
+      <w:r>
+        <w:rPr>
+          <w:rFonts w:ascii="Times New Roman" w:hAnsi="Times New Roman" w:cs="Times New Roman"/>
+          <w:sz w:val="24"/>
+          <w:szCs w:val="24"/>
+        </w:rPr>
+        <w:t>Hertz Foundation Fellowship</w:t>
+      </w:r>
+      <w:r>
+        <w:rPr>
+          <w:rFonts w:ascii="Times New Roman" w:hAnsi="Times New Roman" w:cs="Times New Roman"/>
+          <w:sz w:val="24"/>
+          <w:szCs w:val="24"/>
+        </w:rPr>
+        <w:tab/>
+      </w:r>
+      <w:r>
+        <w:rPr>
+          <w:rFonts w:ascii="Times New Roman" w:hAnsi="Times New Roman" w:cs="Times New Roman"/>
+          <w:iCs/>
+          <w:sz w:val="24"/>
+          <w:szCs w:val="24"/>
+        </w:rPr>
+        <w:t>20</w:t>
+      </w:r>
+      <w:r>
+        <w:rPr>
+          <w:rFonts w:ascii="Times New Roman" w:hAnsi="Times New Roman" w:cs="Times New Roman"/>
+          <w:iCs/>
+          <w:sz w:val="24"/>
+          <w:szCs w:val="24"/>
+        </w:rPr>
+        <w:t>22</w:t>
       </w:r>
     </w:p>
     <w:p>
@@ -1459,228 +2511,19 @@
         <w:spacing w:after="0" w:line="240" w:lineRule="auto"/>
         <w:rPr>
           <w:rFonts w:ascii="Times New Roman" w:hAnsi="Times New Roman" w:cs="Times New Roman"/>
+          <w:iCs/>
+          <w:sz w:val="24"/>
+          <w:szCs w:val="24"/>
+        </w:rPr>
+      </w:pPr>
+      <w:r>
+        <w:rPr>
+          <w:rFonts w:ascii="Times New Roman" w:hAnsi="Times New Roman" w:cs="Times New Roman"/>
           <w:i/>
-          <w:iCs/>
-          <w:sz w:val="24"/>
-          <w:szCs w:val="24"/>
-        </w:rPr>
-      </w:pPr>
-      <w:r>
-        <w:rPr>
-          <w:rFonts w:ascii="Times New Roman" w:hAnsi="Times New Roman" w:cs="Times New Roman"/>
-          <w:i/>
-          <w:iCs/>
-          <w:sz w:val="24"/>
-          <w:szCs w:val="24"/>
-        </w:rPr>
-        <w:lastRenderedPageBreak/>
-        <w:t>Honorable mention and small monetary prize for essay on ge</w:t>
-      </w:r>
-      <w:r>
-        <w:rPr>
-          <w:rFonts w:ascii="Times New Roman" w:hAnsi="Times New Roman" w:cs="Times New Roman"/>
-          <w:i/>
-          <w:iCs/>
-          <w:sz w:val="24"/>
-          <w:szCs w:val="24"/>
-        </w:rPr>
-        <w:t>netic</w:t>
-      </w:r>
-      <w:r>
-        <w:rPr>
-          <w:rFonts w:ascii="Times New Roman" w:hAnsi="Times New Roman" w:cs="Times New Roman"/>
-          <w:i/>
-          <w:iCs/>
-          <w:sz w:val="24"/>
-          <w:szCs w:val="24"/>
-        </w:rPr>
-        <w:t xml:space="preserve"> privacy written for MIT-wide Envisioning the Future of Computing Essay Prize.</w:t>
-      </w:r>
-      <w:r>
-        <w:rPr>
-          <w:rFonts w:ascii="Times New Roman" w:hAnsi="Times New Roman" w:cs="Times New Roman"/>
-          <w:i/>
-          <w:iCs/>
-          <w:sz w:val="24"/>
-          <w:szCs w:val="24"/>
-        </w:rPr>
-        <w:t xml:space="preserve"> Essay available </w:t>
-      </w:r>
-      <w:hyperlink r:id="rId14" w:history="1">
-        <w:r>
-          <w:rPr>
-            <w:rStyle w:val="Hyperlink"/>
-            <w:rFonts w:ascii="Times New Roman" w:hAnsi="Times New Roman" w:cs="Times New Roman"/>
-            <w:i/>
-            <w:iCs/>
-            <w:sz w:val="24"/>
-            <w:szCs w:val="24"/>
-          </w:rPr>
-          <w:t>here</w:t>
-        </w:r>
-      </w:hyperlink>
-      <w:r>
-        <w:rPr>
-          <w:rFonts w:ascii="Times New Roman" w:hAnsi="Times New Roman" w:cs="Times New Roman"/>
-          <w:i/>
-          <w:iCs/>
-          <w:sz w:val="24"/>
-          <w:szCs w:val="24"/>
-        </w:rPr>
-        <w:t>.</w:t>
-      </w:r>
-    </w:p>
-    <w:p>
-      <w:pPr>
-        <w:tabs>
-          <w:tab w:val="right" w:pos="9360"/>
-        </w:tabs>
-        <w:autoSpaceDE w:val="0"/>
-        <w:autoSpaceDN w:val="0"/>
-        <w:adjustRightInd w:val="0"/>
-        <w:spacing w:after="0" w:line="240" w:lineRule="auto"/>
-        <w:rPr>
-          <w:rFonts w:ascii="Times New Roman" w:hAnsi="Times New Roman" w:cs="Times New Roman"/>
-          <w:iCs/>
-          <w:sz w:val="24"/>
-          <w:szCs w:val="24"/>
-        </w:rPr>
-      </w:pPr>
-      <w:r>
-        <w:rPr>
-          <w:rFonts w:ascii="Times New Roman" w:hAnsi="Times New Roman" w:cs="Times New Roman"/>
-          <w:sz w:val="24"/>
-          <w:szCs w:val="24"/>
-        </w:rPr>
-        <w:t>RECOMB Travel Fellowship</w:t>
-      </w:r>
-      <w:r>
-        <w:rPr>
-          <w:rFonts w:ascii="Times New Roman" w:hAnsi="Times New Roman" w:cs="Times New Roman"/>
-          <w:sz w:val="24"/>
-          <w:szCs w:val="24"/>
-        </w:rPr>
-        <w:tab/>
-      </w:r>
-      <w:r>
-        <w:rPr>
-          <w:rFonts w:ascii="Times New Roman" w:hAnsi="Times New Roman" w:cs="Times New Roman"/>
-          <w:iCs/>
-          <w:sz w:val="24"/>
-          <w:szCs w:val="24"/>
-        </w:rPr>
-        <w:t>20</w:t>
-      </w:r>
-      <w:r>
-        <w:rPr>
-          <w:rFonts w:ascii="Times New Roman" w:hAnsi="Times New Roman" w:cs="Times New Roman"/>
-          <w:iCs/>
-          <w:sz w:val="24"/>
-          <w:szCs w:val="24"/>
-        </w:rPr>
-        <w:t>23</w:t>
-      </w:r>
-    </w:p>
-    <w:p>
-      <w:pPr>
-        <w:tabs>
-          <w:tab w:val="right" w:pos="9360"/>
-        </w:tabs>
-        <w:autoSpaceDE w:val="0"/>
-        <w:autoSpaceDN w:val="0"/>
-        <w:adjustRightInd w:val="0"/>
-        <w:spacing w:after="0" w:line="240" w:lineRule="auto"/>
-        <w:rPr>
-          <w:rFonts w:ascii="Times New Roman" w:hAnsi="Times New Roman" w:cs="Times New Roman"/>
-          <w:iCs/>
-          <w:sz w:val="24"/>
-          <w:szCs w:val="24"/>
-        </w:rPr>
-      </w:pPr>
-      <w:r>
-        <w:rPr>
-          <w:rFonts w:ascii="Times New Roman" w:hAnsi="Times New Roman" w:cs="Times New Roman"/>
-          <w:sz w:val="24"/>
-          <w:szCs w:val="24"/>
-        </w:rPr>
-        <w:t>National Science Foundation Graduate Research Fellowship</w:t>
-      </w:r>
-      <w:r>
-        <w:rPr>
-          <w:rFonts w:ascii="Times New Roman" w:hAnsi="Times New Roman" w:cs="Times New Roman"/>
-          <w:sz w:val="24"/>
-          <w:szCs w:val="24"/>
-        </w:rPr>
-        <w:tab/>
-      </w:r>
-      <w:r>
-        <w:rPr>
-          <w:rFonts w:ascii="Times New Roman" w:hAnsi="Times New Roman" w:cs="Times New Roman"/>
-          <w:iCs/>
-          <w:sz w:val="24"/>
-          <w:szCs w:val="24"/>
-        </w:rPr>
-        <w:t>20</w:t>
-      </w:r>
-      <w:r>
-        <w:rPr>
-          <w:rFonts w:ascii="Times New Roman" w:hAnsi="Times New Roman" w:cs="Times New Roman"/>
-          <w:iCs/>
-          <w:sz w:val="24"/>
-          <w:szCs w:val="24"/>
-        </w:rPr>
-        <w:t>22</w:t>
-      </w:r>
-    </w:p>
-    <w:p>
-      <w:pPr>
-        <w:tabs>
-          <w:tab w:val="right" w:pos="9360"/>
-        </w:tabs>
-        <w:autoSpaceDE w:val="0"/>
-        <w:autoSpaceDN w:val="0"/>
-        <w:adjustRightInd w:val="0"/>
-        <w:spacing w:after="0" w:line="240" w:lineRule="auto"/>
-        <w:rPr>
-          <w:rFonts w:ascii="Times New Roman" w:hAnsi="Times New Roman" w:cs="Times New Roman"/>
-          <w:iCs/>
-          <w:sz w:val="24"/>
-          <w:szCs w:val="24"/>
-        </w:rPr>
-      </w:pPr>
-      <w:r>
-        <w:rPr>
-          <w:rFonts w:ascii="Times New Roman" w:hAnsi="Times New Roman" w:cs="Times New Roman"/>
-          <w:sz w:val="24"/>
-          <w:szCs w:val="24"/>
-        </w:rPr>
-        <w:t>Hertz Foundation Fellowship</w:t>
-      </w:r>
-      <w:r>
-        <w:rPr>
-          <w:rFonts w:ascii="Times New Roman" w:hAnsi="Times New Roman" w:cs="Times New Roman"/>
-          <w:sz w:val="24"/>
-          <w:szCs w:val="24"/>
-        </w:rPr>
-        <w:tab/>
-      </w:r>
-      <w:r>
-        <w:rPr>
-          <w:rFonts w:ascii="Times New Roman" w:hAnsi="Times New Roman" w:cs="Times New Roman"/>
-          <w:iCs/>
-          <w:sz w:val="24"/>
-          <w:szCs w:val="24"/>
-        </w:rPr>
-        <w:t>20</w:t>
-      </w:r>
-      <w:r>
-        <w:rPr>
-          <w:rFonts w:ascii="Times New Roman" w:hAnsi="Times New Roman" w:cs="Times New Roman"/>
-          <w:iCs/>
-          <w:sz w:val="24"/>
-          <w:szCs w:val="24"/>
-        </w:rPr>
-        <w:t>22</w:t>
+          <w:sz w:val="24"/>
+          <w:szCs w:val="24"/>
+        </w:rPr>
+        <w:t>Selected for the Hertz Fellowship (one of 13 across the US) which covers full PhD funding for five years.</w:t>
       </w:r>
     </w:p>
     <w:p>
@@ -1711,40 +2554,9 @@
           <w:sz w:val="24"/>
           <w:szCs w:val="24"/>
         </w:rPr>
-        <w:t>Selected for the Hertz Fellowship (one of 13 across the US) which covers full PhD funding for five years.</w:t>
-      </w:r>
-    </w:p>
-    <w:p>
-      <w:pPr>
-        <w:pStyle w:val="ListParagraph"/>
-        <w:numPr>
-          <w:ilvl w:val="0"/>
-          <w:numId w:val="1"/>
-        </w:numPr>
-        <w:tabs>
-          <w:tab w:val="right" w:pos="9360"/>
-        </w:tabs>
-        <w:autoSpaceDE w:val="0"/>
-        <w:autoSpaceDN w:val="0"/>
-        <w:adjustRightInd w:val="0"/>
-        <w:spacing w:after="0" w:line="240" w:lineRule="auto"/>
-        <w:rPr>
-          <w:rFonts w:ascii="Times New Roman" w:hAnsi="Times New Roman" w:cs="Times New Roman"/>
-          <w:iCs/>
-          <w:sz w:val="24"/>
-          <w:szCs w:val="24"/>
-        </w:rPr>
-      </w:pPr>
-      <w:r>
-        <w:rPr>
-          <w:rFonts w:ascii="Times New Roman" w:hAnsi="Times New Roman" w:cs="Times New Roman"/>
-          <w:i/>
-          <w:sz w:val="24"/>
-          <w:szCs w:val="24"/>
-        </w:rPr>
         <w:t xml:space="preserve">Press: </w:t>
       </w:r>
-      <w:hyperlink r:id="rId15" w:history="1">
+      <w:hyperlink r:id="rId14" w:history="1">
         <w:r>
           <w:rPr>
             <w:rStyle w:val="Hyperlink"/>
@@ -1765,7 +2577,7 @@
         </w:rPr>
         <w:t xml:space="preserve">, </w:t>
       </w:r>
-      <w:hyperlink r:id="rId16" w:history="1">
+      <w:hyperlink r:id="rId15" w:history="1">
         <w:r>
           <w:rPr>
             <w:rStyle w:val="Hyperlink"/>
@@ -1789,6 +2601,113 @@
         <w:spacing w:after="0" w:line="240" w:lineRule="auto"/>
         <w:rPr>
           <w:rFonts w:ascii="Times New Roman" w:hAnsi="Times New Roman" w:cs="Times New Roman"/>
+          <w:sz w:val="24"/>
+          <w:szCs w:val="24"/>
+        </w:rPr>
+      </w:pPr>
+      <w:r>
+        <w:rPr>
+          <w:rFonts w:ascii="Times New Roman" w:hAnsi="Times New Roman" w:cs="Times New Roman"/>
+          <w:sz w:val="24"/>
+          <w:szCs w:val="24"/>
+        </w:rPr>
+        <w:t>Derek Bok Award for Distinction in Teaching</w:t>
+      </w:r>
+      <w:r>
+        <w:rPr>
+          <w:rFonts w:ascii="Times New Roman" w:hAnsi="Times New Roman" w:cs="Times New Roman"/>
+          <w:sz w:val="24"/>
+          <w:szCs w:val="24"/>
+        </w:rPr>
+        <w:tab/>
+        <w:t>2022</w:t>
+      </w:r>
+    </w:p>
+    <w:p>
+      <w:pPr>
+        <w:tabs>
+          <w:tab w:val="right" w:pos="9360"/>
+        </w:tabs>
+        <w:autoSpaceDE w:val="0"/>
+        <w:autoSpaceDN w:val="0"/>
+        <w:adjustRightInd w:val="0"/>
+        <w:spacing w:after="0" w:line="240" w:lineRule="auto"/>
+        <w:rPr>
+          <w:rFonts w:ascii="Times New Roman" w:hAnsi="Times New Roman" w:cs="Times New Roman"/>
+          <w:sz w:val="24"/>
+          <w:szCs w:val="24"/>
+        </w:rPr>
+      </w:pPr>
+      <w:r>
+        <w:rPr>
+          <w:rFonts w:ascii="Times New Roman" w:hAnsi="Times New Roman" w:cs="Times New Roman"/>
+          <w:sz w:val="24"/>
+          <w:szCs w:val="24"/>
+        </w:rPr>
+        <w:t>ASHG Reviewers’ Choice Award</w:t>
+      </w:r>
+      <w:r>
+        <w:rPr>
+          <w:rFonts w:ascii="Times New Roman" w:hAnsi="Times New Roman" w:cs="Times New Roman"/>
+          <w:sz w:val="24"/>
+          <w:szCs w:val="24"/>
+        </w:rPr>
+        <w:tab/>
+        <w:t>2021</w:t>
+      </w:r>
+    </w:p>
+    <w:p>
+      <w:pPr>
+        <w:tabs>
+          <w:tab w:val="right" w:pos="9360"/>
+        </w:tabs>
+        <w:autoSpaceDE w:val="0"/>
+        <w:autoSpaceDN w:val="0"/>
+        <w:adjustRightInd w:val="0"/>
+        <w:spacing w:after="0" w:line="240" w:lineRule="auto"/>
+        <w:rPr>
+          <w:rFonts w:ascii="Times New Roman" w:hAnsi="Times New Roman" w:cs="Times New Roman"/>
+          <w:sz w:val="24"/>
+          <w:szCs w:val="24"/>
+        </w:rPr>
+      </w:pPr>
+      <w:r>
+        <w:rPr>
+          <w:rFonts w:ascii="Times New Roman" w:hAnsi="Times New Roman" w:cs="Times New Roman"/>
+          <w:sz w:val="24"/>
+          <w:szCs w:val="24"/>
+        </w:rPr>
+        <w:t xml:space="preserve">John Harvard Scholar </w:t>
+      </w:r>
+      <w:r>
+        <w:rPr>
+          <w:rFonts w:ascii="Times New Roman" w:hAnsi="Times New Roman" w:cs="Times New Roman"/>
+          <w:sz w:val="24"/>
+          <w:szCs w:val="24"/>
+        </w:rPr>
+        <w:tab/>
+        <w:t>202</w:t>
+      </w:r>
+      <w:r>
+        <w:rPr>
+          <w:rFonts w:ascii="Times New Roman" w:hAnsi="Times New Roman" w:cs="Times New Roman"/>
+          <w:sz w:val="24"/>
+          <w:szCs w:val="24"/>
+        </w:rPr>
+        <w:t>0, 2021</w:t>
+      </w:r>
+    </w:p>
+    <w:p>
+      <w:pPr>
+        <w:tabs>
+          <w:tab w:val="right" w:pos="9360"/>
+        </w:tabs>
+        <w:autoSpaceDE w:val="0"/>
+        <w:autoSpaceDN w:val="0"/>
+        <w:adjustRightInd w:val="0"/>
+        <w:spacing w:after="0" w:line="240" w:lineRule="auto"/>
+        <w:rPr>
+          <w:rFonts w:ascii="Times New Roman" w:hAnsi="Times New Roman" w:cs="Times New Roman"/>
           <w:iCs/>
           <w:sz w:val="24"/>
           <w:szCs w:val="24"/>
@@ -2208,7 +3127,25 @@
           <w:sz w:val="24"/>
           <w:szCs w:val="24"/>
         </w:rPr>
-        <w:t>(Prof. Michael Mitzenmacher)</w:t>
+        <w:t xml:space="preserve">(Prof. Michael </w:t>
+      </w:r>
+      <w:proofErr w:type="spellStart"/>
+      <w:r>
+        <w:rPr>
+          <w:rFonts w:ascii="Times New Roman" w:hAnsi="Times New Roman" w:cs="Times New Roman"/>
+          <w:sz w:val="24"/>
+          <w:szCs w:val="24"/>
+        </w:rPr>
+        <w:t>Mitzenmacher</w:t>
+      </w:r>
+      <w:proofErr w:type="spellEnd"/>
+      <w:r>
+        <w:rPr>
+          <w:rFonts w:ascii="Times New Roman" w:hAnsi="Times New Roman" w:cs="Times New Roman"/>
+          <w:sz w:val="24"/>
+          <w:szCs w:val="24"/>
+        </w:rPr>
+        <w:t>)</w:t>
       </w:r>
       <w:r>
         <w:rPr>
@@ -2274,7 +3211,6 @@
     </w:p>
     <w:p>
       <w:pPr>
-        <w:pStyle w:val="ListParagraph"/>
         <w:tabs>
           <w:tab w:val="right" w:pos="9360"/>
         </w:tabs>
@@ -2288,22 +3224,6 @@
           <w:szCs w:val="24"/>
         </w:rPr>
       </w:pPr>
-    </w:p>
-    <w:p>
-      <w:pPr>
-        <w:tabs>
-          <w:tab w:val="right" w:pos="9360"/>
-        </w:tabs>
-        <w:autoSpaceDE w:val="0"/>
-        <w:autoSpaceDN w:val="0"/>
-        <w:adjustRightInd w:val="0"/>
-        <w:spacing w:after="0" w:line="240" w:lineRule="auto"/>
-        <w:rPr>
-          <w:rFonts w:ascii="Times New Roman" w:hAnsi="Times New Roman" w:cs="Times New Roman"/>
-          <w:sz w:val="24"/>
-          <w:szCs w:val="24"/>
-        </w:rPr>
-      </w:pPr>
       <w:r>
         <w:rPr>
           <w:rFonts w:ascii="Times New Roman" w:hAnsi="Times New Roman" w:cs="Times New Roman"/>
@@ -2368,21 +3288,6 @@
         </w:rPr>
         <w:t>Fall 2020</w:t>
       </w:r>
-    </w:p>
-    <w:p>
-      <w:pPr>
-        <w:tabs>
-          <w:tab w:val="right" w:pos="9360"/>
-        </w:tabs>
-        <w:spacing w:after="0"/>
-        <w:rPr>
-          <w:rFonts w:ascii="Times New Roman" w:hAnsi="Times New Roman" w:cs="Times New Roman"/>
-          <w:b/>
-          <w:bCs/>
-          <w:sz w:val="24"/>
-          <w:szCs w:val="24"/>
-        </w:rPr>
-      </w:pPr>
     </w:p>
     <w:p>
       <w:pPr>
@@ -2534,32 +3439,7 @@
           <w:sz w:val="24"/>
           <w:szCs w:val="24"/>
         </w:rPr>
-        <w:t>Reviewer, Machine Learning for Healthcare</w:t>
-      </w:r>
-      <w:r>
-        <w:rPr>
-          <w:rFonts w:ascii="Times New Roman" w:hAnsi="Times New Roman" w:cs="Times New Roman"/>
-          <w:sz w:val="24"/>
-          <w:szCs w:val="24"/>
-        </w:rPr>
-        <w:t xml:space="preserve"> Conference</w:t>
-      </w:r>
-      <w:r>
-        <w:rPr>
-          <w:rFonts w:ascii="Times New Roman" w:hAnsi="Times New Roman" w:cs="Times New Roman"/>
-          <w:sz w:val="24"/>
-          <w:szCs w:val="24"/>
-        </w:rPr>
-        <w:t xml:space="preserve"> (ML4H)</w:t>
-      </w:r>
-      <w:r>
-        <w:rPr>
-          <w:rFonts w:ascii="Times New Roman" w:hAnsi="Times New Roman" w:cs="Times New Roman"/>
-          <w:sz w:val="24"/>
-          <w:szCs w:val="24"/>
-        </w:rPr>
-        <w:tab/>
-        <w:t>2023</w:t>
+        <w:t>Member, NIST AI Safety Institute Task Force on Red Teaming                                              2024</w:t>
       </w:r>
     </w:p>
     <w:p>
@@ -2571,35 +3451,20 @@
         <w:autoSpaceDN w:val="0"/>
         <w:adjustRightInd w:val="0"/>
         <w:spacing w:after="0" w:line="240" w:lineRule="auto"/>
-        <w:rPr>
-          <w:rFonts w:ascii="Times New Roman" w:hAnsi="Times New Roman" w:cs="Times New Roman"/>
-          <w:sz w:val="24"/>
-          <w:szCs w:val="24"/>
-        </w:rPr>
-      </w:pPr>
-      <w:r>
-        <w:rPr>
-          <w:rFonts w:ascii="Times New Roman" w:hAnsi="Times New Roman" w:cs="Times New Roman"/>
-          <w:sz w:val="24"/>
-          <w:szCs w:val="24"/>
-        </w:rPr>
-        <w:t>Reviewer, Neural Information Processing Systems (NeurIPS)</w:t>
-      </w:r>
-      <w:r>
-        <w:rPr>
-          <w:rFonts w:ascii="Times New Roman" w:hAnsi="Times New Roman" w:cs="Times New Roman"/>
-          <w:sz w:val="24"/>
-          <w:szCs w:val="24"/>
-        </w:rPr>
-        <w:tab/>
-      </w:r>
-      <w:r>
-        <w:rPr>
-          <w:rFonts w:ascii="Times New Roman" w:hAnsi="Times New Roman" w:cs="Times New Roman"/>
-          <w:sz w:val="24"/>
-          <w:szCs w:val="24"/>
-        </w:rPr>
-        <w:t>2023</w:t>
+        <w:jc w:val="right"/>
+        <w:rPr>
+          <w:rFonts w:ascii="Times New Roman" w:hAnsi="Times New Roman" w:cs="Times New Roman"/>
+          <w:sz w:val="24"/>
+          <w:szCs w:val="24"/>
+        </w:rPr>
+      </w:pPr>
+      <w:r>
+        <w:rPr>
+          <w:rFonts w:ascii="Times New Roman" w:hAnsi="Times New Roman" w:cs="Times New Roman"/>
+          <w:sz w:val="24"/>
+          <w:szCs w:val="24"/>
+        </w:rPr>
+        <w:t>Planning Committee, Hertz Foundation Summer Workshop                                                    2023</w:t>
       </w:r>
     </w:p>
     <w:p>
@@ -2623,6 +3488,114 @@
           <w:sz w:val="24"/>
           <w:szCs w:val="24"/>
         </w:rPr>
+        <w:t>Reviewer, Machine Learning for Healthcare</w:t>
+      </w:r>
+      <w:r>
+        <w:rPr>
+          <w:rFonts w:ascii="Times New Roman" w:hAnsi="Times New Roman" w:cs="Times New Roman"/>
+          <w:sz w:val="24"/>
+          <w:szCs w:val="24"/>
+        </w:rPr>
+        <w:t xml:space="preserve"> Conference</w:t>
+      </w:r>
+      <w:r>
+        <w:rPr>
+          <w:rFonts w:ascii="Times New Roman" w:hAnsi="Times New Roman" w:cs="Times New Roman"/>
+          <w:sz w:val="24"/>
+          <w:szCs w:val="24"/>
+        </w:rPr>
+        <w:t xml:space="preserve"> (ML4H)</w:t>
+      </w:r>
+      <w:r>
+        <w:rPr>
+          <w:rFonts w:ascii="Times New Roman" w:hAnsi="Times New Roman" w:cs="Times New Roman"/>
+          <w:sz w:val="24"/>
+          <w:szCs w:val="24"/>
+        </w:rPr>
+        <w:tab/>
+        <w:t>2023</w:t>
+      </w:r>
+    </w:p>
+    <w:p>
+      <w:pPr>
+        <w:tabs>
+          <w:tab w:val="right" w:pos="9360"/>
+        </w:tabs>
+        <w:autoSpaceDE w:val="0"/>
+        <w:autoSpaceDN w:val="0"/>
+        <w:adjustRightInd w:val="0"/>
+        <w:spacing w:after="0" w:line="240" w:lineRule="auto"/>
+        <w:rPr>
+          <w:rFonts w:ascii="Times New Roman" w:hAnsi="Times New Roman" w:cs="Times New Roman"/>
+          <w:sz w:val="24"/>
+          <w:szCs w:val="24"/>
+        </w:rPr>
+      </w:pPr>
+      <w:r>
+        <w:rPr>
+          <w:rFonts w:ascii="Times New Roman" w:hAnsi="Times New Roman" w:cs="Times New Roman"/>
+          <w:sz w:val="24"/>
+          <w:szCs w:val="24"/>
+        </w:rPr>
+        <w:t>Reviewer, Neural Information Processing Systems (</w:t>
+      </w:r>
+      <w:proofErr w:type="spellStart"/>
+      <w:r>
+        <w:rPr>
+          <w:rFonts w:ascii="Times New Roman" w:hAnsi="Times New Roman" w:cs="Times New Roman"/>
+          <w:sz w:val="24"/>
+          <w:szCs w:val="24"/>
+        </w:rPr>
+        <w:t>NeurIPS</w:t>
+      </w:r>
+      <w:proofErr w:type="spellEnd"/>
+      <w:r>
+        <w:rPr>
+          <w:rFonts w:ascii="Times New Roman" w:hAnsi="Times New Roman" w:cs="Times New Roman"/>
+          <w:sz w:val="24"/>
+          <w:szCs w:val="24"/>
+        </w:rPr>
+        <w:t>)</w:t>
+      </w:r>
+      <w:r>
+        <w:rPr>
+          <w:rFonts w:ascii="Times New Roman" w:hAnsi="Times New Roman" w:cs="Times New Roman"/>
+          <w:sz w:val="24"/>
+          <w:szCs w:val="24"/>
+        </w:rPr>
+        <w:tab/>
+      </w:r>
+      <w:r>
+        <w:rPr>
+          <w:rFonts w:ascii="Times New Roman" w:hAnsi="Times New Roman" w:cs="Times New Roman"/>
+          <w:sz w:val="24"/>
+          <w:szCs w:val="24"/>
+        </w:rPr>
+        <w:t>2023</w:t>
+      </w:r>
+    </w:p>
+    <w:p>
+      <w:pPr>
+        <w:tabs>
+          <w:tab w:val="right" w:pos="9360"/>
+        </w:tabs>
+        <w:autoSpaceDE w:val="0"/>
+        <w:autoSpaceDN w:val="0"/>
+        <w:adjustRightInd w:val="0"/>
+        <w:spacing w:after="0" w:line="240" w:lineRule="auto"/>
+        <w:rPr>
+          <w:rFonts w:ascii="Times New Roman" w:hAnsi="Times New Roman" w:cs="Times New Roman"/>
+          <w:sz w:val="24"/>
+          <w:szCs w:val="24"/>
+        </w:rPr>
+      </w:pPr>
+      <w:r>
+        <w:rPr>
+          <w:rFonts w:ascii="Times New Roman" w:hAnsi="Times New Roman" w:cs="Times New Roman"/>
+          <w:sz w:val="24"/>
+          <w:szCs w:val="24"/>
+        </w:rPr>
+        <w:lastRenderedPageBreak/>
         <w:t xml:space="preserve">Reviewer, </w:t>
       </w:r>
       <w:r>
@@ -2715,24 +3688,7 @@
           <w:sz w:val="24"/>
           <w:szCs w:val="24"/>
         </w:rPr>
-        <w:t>Founder and Organizer, MIT Algorithmic Fairness Reading Group</w:t>
-      </w:r>
-      <w:r>
-        <w:rPr>
-          <w:rFonts w:ascii="Times New Roman" w:hAnsi="Times New Roman" w:cs="Times New Roman"/>
-          <w:sz w:val="24"/>
-          <w:szCs w:val="24"/>
-        </w:rPr>
-        <w:tab/>
-        <w:t>2023</w:t>
-      </w:r>
-      <w:r>
-        <w:rPr>
-          <w:rFonts w:ascii="Times New Roman" w:hAnsi="Times New Roman" w:cs="Times New Roman"/>
-          <w:sz w:val="24"/>
-          <w:szCs w:val="24"/>
-        </w:rPr>
-        <w:t>-present</w:t>
+        <w:t>Board Member, MIT EECS Graduate Application Assistance Program.                     2024-present</w:t>
       </w:r>
     </w:p>
     <w:p>
@@ -2751,25 +3707,18 @@
         <w:spacing w:after="0" w:line="240" w:lineRule="auto"/>
         <w:rPr>
           <w:rFonts w:ascii="Times New Roman" w:hAnsi="Times New Roman" w:cs="Times New Roman"/>
-          <w:i/>
-          <w:iCs/>
-          <w:sz w:val="24"/>
-          <w:szCs w:val="24"/>
-        </w:rPr>
-      </w:pPr>
-      <w:hyperlink r:id="rId17" w:history="1">
-        <w:r>
-          <w:rPr>
-            <w:rStyle w:val="Hyperlink"/>
-            <w:rFonts w:ascii="Times New Roman" w:hAnsi="Times New Roman" w:cs="Times New Roman"/>
-            <w:i/>
-            <w:iCs/>
-            <w:sz w:val="24"/>
-            <w:szCs w:val="24"/>
-          </w:rPr>
-          <w:t>Website</w:t>
-        </w:r>
-      </w:hyperlink>
+          <w:sz w:val="24"/>
+          <w:szCs w:val="24"/>
+        </w:rPr>
+      </w:pPr>
+      <w:r>
+        <w:rPr>
+          <w:rFonts w:ascii="Times New Roman" w:hAnsi="Times New Roman" w:cs="Times New Roman"/>
+          <w:sz w:val="24"/>
+          <w:szCs w:val="24"/>
+        </w:rPr>
+        <w:t>Mentor, 2022-present</w:t>
+      </w:r>
     </w:p>
     <w:p>
       <w:pPr>
@@ -2792,7 +3741,7 @@
           <w:sz w:val="24"/>
           <w:szCs w:val="24"/>
         </w:rPr>
-        <w:t>Tutor/Mentor, Research Science Institute</w:t>
+        <w:t>Tutor, Research Science Institute</w:t>
       </w:r>
       <w:r>
         <w:rPr>
@@ -2817,6 +3766,14 @@
           <w:szCs w:val="24"/>
         </w:rPr>
         <w:t>2023</w:t>
+      </w:r>
+      <w:r>
+        <w:rPr>
+          <w:rFonts w:ascii="Times New Roman" w:hAnsi="Times New Roman" w:cs="Times New Roman"/>
+          <w:sz w:val="24"/>
+          <w:szCs w:val="24"/>
+        </w:rPr>
+        <w:t>, 2024</w:t>
       </w:r>
     </w:p>
     <w:p>
@@ -2841,39 +3798,6 @@
           <w:szCs w:val="24"/>
         </w:rPr>
         <w:t>Non-Resident Tutor, Mather House (Harvard University)</w:t>
-      </w:r>
-      <w:r>
-        <w:rPr>
-          <w:rFonts w:ascii="Times New Roman" w:hAnsi="Times New Roman" w:cs="Times New Roman"/>
-          <w:sz w:val="24"/>
-          <w:szCs w:val="24"/>
-        </w:rPr>
-        <w:tab/>
-        <w:t>2022-present</w:t>
-      </w:r>
-    </w:p>
-    <w:p>
-      <w:pPr>
-        <w:tabs>
-          <w:tab w:val="right" w:pos="9360"/>
-        </w:tabs>
-        <w:autoSpaceDE w:val="0"/>
-        <w:autoSpaceDN w:val="0"/>
-        <w:adjustRightInd w:val="0"/>
-        <w:spacing w:after="0" w:line="240" w:lineRule="auto"/>
-        <w:rPr>
-          <w:rFonts w:ascii="Times New Roman" w:hAnsi="Times New Roman" w:cs="Times New Roman"/>
-          <w:sz w:val="24"/>
-          <w:szCs w:val="24"/>
-        </w:rPr>
-      </w:pPr>
-      <w:r>
-        <w:rPr>
-          <w:rFonts w:ascii="Times New Roman" w:hAnsi="Times New Roman" w:cs="Times New Roman"/>
-          <w:sz w:val="24"/>
-          <w:szCs w:val="24"/>
-        </w:rPr>
-        <w:t>Mentor, MIT EECS Graduate Application Assistant Program</w:t>
       </w:r>
       <w:r>
         <w:rPr>
@@ -2946,122 +3870,8 @@
           <w:sz w:val="24"/>
           <w:szCs w:val="24"/>
         </w:rPr>
-        <w:t>PROFESSIONAL</w:t>
-      </w:r>
-      <w:r>
-        <w:rPr>
-          <w:rFonts w:ascii="Times New Roman" w:hAnsi="Times New Roman" w:cs="Times New Roman"/>
-          <w:b/>
-          <w:sz w:val="24"/>
-          <w:szCs w:val="24"/>
-        </w:rPr>
-        <w:t xml:space="preserve"> EXPERIENCE</w:t>
-      </w:r>
-      <w:r>
-        <w:rPr>
-          <w:rFonts w:ascii="Times New Roman" w:hAnsi="Times New Roman" w:cs="Times New Roman"/>
-          <w:b/>
-          <w:sz w:val="24"/>
-          <w:szCs w:val="24"/>
-        </w:rPr>
-        <w:tab/>
-      </w:r>
-    </w:p>
-    <w:p>
-      <w:pPr>
-        <w:tabs>
-          <w:tab w:val="right" w:pos="9360"/>
-        </w:tabs>
-        <w:autoSpaceDE w:val="0"/>
-        <w:autoSpaceDN w:val="0"/>
-        <w:adjustRightInd w:val="0"/>
-        <w:spacing w:after="0" w:line="240" w:lineRule="auto"/>
-        <w:rPr>
-          <w:rFonts w:ascii="Times New Roman" w:hAnsi="Times New Roman" w:cs="Times New Roman"/>
-          <w:sz w:val="24"/>
-          <w:szCs w:val="24"/>
-        </w:rPr>
-      </w:pPr>
-      <w:r>
-        <w:rPr>
-          <w:rFonts w:ascii="Times New Roman" w:hAnsi="Times New Roman" w:cs="Times New Roman"/>
-          <w:b/>
-          <w:sz w:val="24"/>
-          <w:szCs w:val="24"/>
-        </w:rPr>
-        <w:t>Raytheon BBN Technologies</w:t>
-      </w:r>
-      <w:r>
-        <w:rPr>
-          <w:rFonts w:ascii="Times New Roman" w:hAnsi="Times New Roman" w:cs="Times New Roman"/>
-          <w:sz w:val="24"/>
-          <w:szCs w:val="24"/>
-        </w:rPr>
-        <w:tab/>
-      </w:r>
-      <w:r>
-        <w:rPr>
-          <w:rFonts w:ascii="Times New Roman" w:hAnsi="Times New Roman" w:cs="Times New Roman"/>
-          <w:sz w:val="24"/>
-          <w:szCs w:val="24"/>
-        </w:rPr>
-        <w:t>Cambridge, MA</w:t>
-      </w:r>
-    </w:p>
-    <w:p>
-      <w:pPr>
-        <w:tabs>
-          <w:tab w:val="right" w:pos="9360"/>
-        </w:tabs>
-        <w:autoSpaceDE w:val="0"/>
-        <w:autoSpaceDN w:val="0"/>
-        <w:adjustRightInd w:val="0"/>
-        <w:spacing w:after="0" w:line="240" w:lineRule="auto"/>
-        <w:rPr>
-          <w:rFonts w:ascii="Times New Roman" w:hAnsi="Times New Roman" w:cs="Times New Roman"/>
-          <w:sz w:val="24"/>
-          <w:szCs w:val="24"/>
-        </w:rPr>
-      </w:pPr>
-      <w:r>
-        <w:rPr>
-          <w:rFonts w:ascii="Times New Roman" w:hAnsi="Times New Roman" w:cs="Times New Roman"/>
-          <w:i/>
-          <w:sz w:val="24"/>
-          <w:szCs w:val="24"/>
-        </w:rPr>
-        <w:t>Software Intern, Machine Translation Division</w:t>
-      </w:r>
-      <w:r>
-        <w:rPr>
-          <w:rFonts w:ascii="Times New Roman" w:hAnsi="Times New Roman" w:cs="Times New Roman"/>
-          <w:sz w:val="24"/>
-          <w:szCs w:val="24"/>
-        </w:rPr>
-        <w:tab/>
-      </w:r>
-      <w:r>
-        <w:rPr>
-          <w:rFonts w:ascii="Times New Roman" w:hAnsi="Times New Roman" w:cs="Times New Roman"/>
-          <w:sz w:val="24"/>
-          <w:szCs w:val="24"/>
-        </w:rPr>
-        <w:t>2020</w:t>
-      </w:r>
-    </w:p>
-    <w:p>
-      <w:pPr>
-        <w:autoSpaceDE w:val="0"/>
-        <w:autoSpaceDN w:val="0"/>
-        <w:adjustRightInd w:val="0"/>
-        <w:spacing w:after="0" w:line="240" w:lineRule="auto"/>
-        <w:rPr>
-          <w:rFonts w:ascii="Times New Roman" w:hAnsi="Times New Roman" w:cs="Times New Roman"/>
-          <w:b/>
-          <w:sz w:val="24"/>
-          <w:szCs w:val="24"/>
-        </w:rPr>
-      </w:pPr>
+        <w:t>MENTORSHIP</w:t>
+      </w:r>
     </w:p>
     <w:p>
       <w:pPr>
@@ -3071,18 +3881,279 @@
         <w:spacing w:after="60"/>
         <w:rPr>
           <w:rFonts w:ascii="Times New Roman" w:hAnsi="Times New Roman" w:cs="Times New Roman"/>
+          <w:bCs/>
+          <w:sz w:val="24"/>
+          <w:szCs w:val="24"/>
+        </w:rPr>
+      </w:pPr>
+      <w:r>
+        <w:rPr>
+          <w:rFonts w:ascii="Times New Roman" w:hAnsi="Times New Roman" w:cs="Times New Roman"/>
+          <w:bCs/>
+          <w:sz w:val="24"/>
+          <w:szCs w:val="24"/>
+        </w:rPr>
+        <w:t>Sophia Lin (RSI student)</w:t>
+      </w:r>
+      <w:r>
+        <w:rPr>
+          <w:rFonts w:ascii="Times New Roman" w:hAnsi="Times New Roman" w:cs="Times New Roman"/>
+          <w:bCs/>
+          <w:sz w:val="24"/>
+          <w:szCs w:val="24"/>
+        </w:rPr>
+        <w:tab/>
+      </w:r>
+      <w:r>
+        <w:rPr>
+          <w:rFonts w:ascii="Times New Roman" w:hAnsi="Times New Roman" w:cs="Times New Roman"/>
+          <w:bCs/>
+          <w:sz w:val="24"/>
+          <w:szCs w:val="24"/>
+        </w:rPr>
+        <w:tab/>
+      </w:r>
+      <w:r>
+        <w:rPr>
+          <w:rFonts w:ascii="Times New Roman" w:hAnsi="Times New Roman" w:cs="Times New Roman"/>
+          <w:bCs/>
+          <w:sz w:val="24"/>
+          <w:szCs w:val="24"/>
+        </w:rPr>
+        <w:tab/>
+      </w:r>
+      <w:r>
+        <w:rPr>
+          <w:rFonts w:ascii="Times New Roman" w:hAnsi="Times New Roman" w:cs="Times New Roman"/>
+          <w:bCs/>
+          <w:sz w:val="24"/>
+          <w:szCs w:val="24"/>
+        </w:rPr>
+        <w:tab/>
+      </w:r>
+      <w:r>
+        <w:rPr>
+          <w:rFonts w:ascii="Times New Roman" w:hAnsi="Times New Roman" w:cs="Times New Roman"/>
+          <w:bCs/>
+          <w:sz w:val="24"/>
+          <w:szCs w:val="24"/>
+        </w:rPr>
+        <w:tab/>
+      </w:r>
+      <w:r>
+        <w:rPr>
+          <w:rFonts w:ascii="Times New Roman" w:hAnsi="Times New Roman" w:cs="Times New Roman"/>
+          <w:bCs/>
+          <w:sz w:val="24"/>
+          <w:szCs w:val="24"/>
+        </w:rPr>
+        <w:tab/>
+      </w:r>
+      <w:r>
+        <w:rPr>
+          <w:rFonts w:ascii="Times New Roman" w:hAnsi="Times New Roman" w:cs="Times New Roman"/>
+          <w:bCs/>
+          <w:sz w:val="24"/>
+          <w:szCs w:val="24"/>
+        </w:rPr>
+        <w:tab/>
+      </w:r>
+      <w:r>
+        <w:rPr>
+          <w:rFonts w:ascii="Times New Roman" w:hAnsi="Times New Roman" w:cs="Times New Roman"/>
+          <w:bCs/>
+          <w:sz w:val="24"/>
+          <w:szCs w:val="24"/>
+        </w:rPr>
+        <w:tab/>
+        <w:t>Summer 2024</w:t>
+      </w:r>
+    </w:p>
+    <w:p>
+      <w:pPr>
+        <w:pBdr>
+          <w:bottom w:val="single" w:sz="4" w:space="1" w:color="auto"/>
+        </w:pBdr>
+        <w:spacing w:after="60"/>
+        <w:rPr>
+          <w:rFonts w:ascii="Times New Roman" w:hAnsi="Times New Roman" w:cs="Times New Roman"/>
           <w:b/>
           <w:sz w:val="24"/>
           <w:szCs w:val="24"/>
         </w:rPr>
       </w:pPr>
-      <w:r>
+    </w:p>
+    <w:p>
+      <w:pPr>
+        <w:pBdr>
+          <w:bottom w:val="single" w:sz="4" w:space="1" w:color="auto"/>
+        </w:pBdr>
+        <w:spacing w:after="60"/>
         <w:rPr>
           <w:rFonts w:ascii="Times New Roman" w:hAnsi="Times New Roman" w:cs="Times New Roman"/>
           <w:b/>
           <w:sz w:val="24"/>
           <w:szCs w:val="24"/>
         </w:rPr>
+      </w:pPr>
+      <w:r>
+        <w:rPr>
+          <w:rFonts w:ascii="Times New Roman" w:hAnsi="Times New Roman" w:cs="Times New Roman"/>
+          <w:b/>
+          <w:sz w:val="24"/>
+          <w:szCs w:val="24"/>
+        </w:rPr>
+        <w:t>INDUSTRIAL</w:t>
+      </w:r>
+      <w:r>
+        <w:rPr>
+          <w:rFonts w:ascii="Times New Roman" w:hAnsi="Times New Roman" w:cs="Times New Roman"/>
+          <w:b/>
+          <w:sz w:val="24"/>
+          <w:szCs w:val="24"/>
+        </w:rPr>
+        <w:t xml:space="preserve"> EXPERIENCE</w:t>
+      </w:r>
+      <w:r>
+        <w:rPr>
+          <w:rFonts w:ascii="Times New Roman" w:hAnsi="Times New Roman" w:cs="Times New Roman"/>
+          <w:b/>
+          <w:sz w:val="24"/>
+          <w:szCs w:val="24"/>
+        </w:rPr>
+        <w:tab/>
+      </w:r>
+    </w:p>
+    <w:p>
+      <w:pPr>
+        <w:tabs>
+          <w:tab w:val="right" w:pos="9360"/>
+        </w:tabs>
+        <w:autoSpaceDE w:val="0"/>
+        <w:autoSpaceDN w:val="0"/>
+        <w:adjustRightInd w:val="0"/>
+        <w:spacing w:after="0" w:line="240" w:lineRule="auto"/>
+        <w:rPr>
+          <w:rFonts w:ascii="Times New Roman" w:hAnsi="Times New Roman" w:cs="Times New Roman"/>
+          <w:sz w:val="24"/>
+          <w:szCs w:val="24"/>
+        </w:rPr>
+      </w:pPr>
+      <w:r>
+        <w:rPr>
+          <w:rFonts w:ascii="Times New Roman" w:hAnsi="Times New Roman" w:cs="Times New Roman"/>
+          <w:b/>
+          <w:sz w:val="24"/>
+          <w:szCs w:val="24"/>
+        </w:rPr>
+        <w:t>BBN Technologies</w:t>
+      </w:r>
+      <w:r>
+        <w:rPr>
+          <w:rFonts w:ascii="Times New Roman" w:hAnsi="Times New Roman" w:cs="Times New Roman"/>
+          <w:sz w:val="24"/>
+          <w:szCs w:val="24"/>
+        </w:rPr>
+        <w:tab/>
+      </w:r>
+      <w:r>
+        <w:rPr>
+          <w:rFonts w:ascii="Times New Roman" w:hAnsi="Times New Roman" w:cs="Times New Roman"/>
+          <w:sz w:val="24"/>
+          <w:szCs w:val="24"/>
+        </w:rPr>
+        <w:t>Cambridge, MA</w:t>
+      </w:r>
+    </w:p>
+    <w:p>
+      <w:pPr>
+        <w:tabs>
+          <w:tab w:val="right" w:pos="9360"/>
+        </w:tabs>
+        <w:autoSpaceDE w:val="0"/>
+        <w:autoSpaceDN w:val="0"/>
+        <w:adjustRightInd w:val="0"/>
+        <w:spacing w:after="0" w:line="240" w:lineRule="auto"/>
+        <w:rPr>
+          <w:rFonts w:ascii="Times New Roman" w:hAnsi="Times New Roman" w:cs="Times New Roman"/>
+          <w:sz w:val="24"/>
+          <w:szCs w:val="24"/>
+        </w:rPr>
+      </w:pPr>
+      <w:r>
+        <w:rPr>
+          <w:rFonts w:ascii="Times New Roman" w:hAnsi="Times New Roman" w:cs="Times New Roman"/>
+          <w:i/>
+          <w:sz w:val="24"/>
+          <w:szCs w:val="24"/>
+        </w:rPr>
+        <w:t>Software Intern, Machine Translation Division</w:t>
+      </w:r>
+      <w:r>
+        <w:rPr>
+          <w:rFonts w:ascii="Times New Roman" w:hAnsi="Times New Roman" w:cs="Times New Roman"/>
+          <w:sz w:val="24"/>
+          <w:szCs w:val="24"/>
+        </w:rPr>
+        <w:tab/>
+      </w:r>
+      <w:r>
+        <w:rPr>
+          <w:rFonts w:ascii="Times New Roman" w:hAnsi="Times New Roman" w:cs="Times New Roman"/>
+          <w:sz w:val="24"/>
+          <w:szCs w:val="24"/>
+        </w:rPr>
+        <w:t>2020</w:t>
+      </w:r>
+    </w:p>
+    <w:p>
+      <w:pPr>
+        <w:autoSpaceDE w:val="0"/>
+        <w:autoSpaceDN w:val="0"/>
+        <w:adjustRightInd w:val="0"/>
+        <w:spacing w:after="0" w:line="240" w:lineRule="auto"/>
+        <w:rPr>
+          <w:rFonts w:ascii="Times New Roman" w:hAnsi="Times New Roman" w:cs="Times New Roman"/>
+          <w:b/>
+          <w:sz w:val="24"/>
+          <w:szCs w:val="24"/>
+        </w:rPr>
+      </w:pPr>
+    </w:p>
+    <w:p>
+      <w:pPr>
+        <w:autoSpaceDE w:val="0"/>
+        <w:autoSpaceDN w:val="0"/>
+        <w:adjustRightInd w:val="0"/>
+        <w:spacing w:after="0" w:line="240" w:lineRule="auto"/>
+        <w:rPr>
+          <w:rFonts w:ascii="Times New Roman" w:hAnsi="Times New Roman" w:cs="Times New Roman"/>
+          <w:b/>
+          <w:sz w:val="24"/>
+          <w:szCs w:val="24"/>
+        </w:rPr>
+      </w:pPr>
+    </w:p>
+    <w:p>
+      <w:pPr>
+        <w:pBdr>
+          <w:bottom w:val="single" w:sz="4" w:space="1" w:color="auto"/>
+        </w:pBdr>
+        <w:spacing w:after="60"/>
+        <w:rPr>
+          <w:rFonts w:ascii="Times New Roman" w:hAnsi="Times New Roman" w:cs="Times New Roman"/>
+          <w:b/>
+          <w:sz w:val="24"/>
+          <w:szCs w:val="24"/>
+        </w:rPr>
+      </w:pPr>
+      <w:r>
+        <w:rPr>
+          <w:rFonts w:ascii="Times New Roman" w:hAnsi="Times New Roman" w:cs="Times New Roman"/>
+          <w:b/>
+          <w:sz w:val="24"/>
+          <w:szCs w:val="24"/>
+        </w:rPr>
         <w:t xml:space="preserve">REFERENCES </w:t>
       </w:r>
       <w:r>
@@ -3113,7 +4184,6 @@
           <w:sz w:val="24"/>
           <w:szCs w:val="24"/>
         </w:rPr>
-        <w:lastRenderedPageBreak/>
         <w:t>Bonnie Berger</w:t>
       </w:r>
     </w:p>
@@ -3179,7 +4249,7 @@
           <w:szCs w:val="24"/>
         </w:rPr>
       </w:pPr>
-      <w:hyperlink r:id="rId18" w:history="1">
+      <w:hyperlink r:id="rId16" w:history="1">
         <w:r>
           <w:rPr>
             <w:rStyle w:val="Hyperlink"/>
@@ -3222,7 +4292,125 @@
           <w:sz w:val="24"/>
           <w:szCs w:val="24"/>
         </w:rPr>
-        <w:t>Hyunghoon Cho</w:t>
+        <w:t>Emma Pierson</w:t>
+      </w:r>
+    </w:p>
+    <w:p>
+      <w:pPr>
+        <w:autoSpaceDE w:val="0"/>
+        <w:autoSpaceDN w:val="0"/>
+        <w:adjustRightInd w:val="0"/>
+        <w:spacing w:after="0" w:line="240" w:lineRule="auto"/>
+        <w:rPr>
+          <w:rFonts w:ascii="Times New Roman" w:hAnsi="Times New Roman" w:cs="Times New Roman"/>
+          <w:sz w:val="24"/>
+          <w:szCs w:val="24"/>
+        </w:rPr>
+      </w:pPr>
+      <w:r>
+        <w:rPr>
+          <w:rFonts w:ascii="Times New Roman" w:hAnsi="Times New Roman" w:cs="Times New Roman"/>
+          <w:sz w:val="24"/>
+          <w:szCs w:val="24"/>
+        </w:rPr>
+        <w:t>University of California, Berkeley</w:t>
+      </w:r>
+    </w:p>
+    <w:p>
+      <w:pPr>
+        <w:autoSpaceDE w:val="0"/>
+        <w:autoSpaceDN w:val="0"/>
+        <w:adjustRightInd w:val="0"/>
+        <w:spacing w:after="0" w:line="240" w:lineRule="auto"/>
+        <w:rPr>
+          <w:rFonts w:ascii="Times New Roman" w:hAnsi="Times New Roman" w:cs="Times New Roman"/>
+          <w:sz w:val="24"/>
+          <w:szCs w:val="24"/>
+        </w:rPr>
+      </w:pPr>
+      <w:r>
+        <w:rPr>
+          <w:rFonts w:ascii="Times New Roman" w:hAnsi="Times New Roman" w:cs="Times New Roman"/>
+          <w:sz w:val="24"/>
+          <w:szCs w:val="24"/>
+        </w:rPr>
+        <w:t>Assistant Professor of Electrical Engineering and Computer Science</w:t>
+      </w:r>
+    </w:p>
+    <w:p>
+      <w:pPr>
+        <w:autoSpaceDE w:val="0"/>
+        <w:autoSpaceDN w:val="0"/>
+        <w:adjustRightInd w:val="0"/>
+        <w:spacing w:after="0" w:line="240" w:lineRule="auto"/>
+        <w:rPr>
+          <w:rFonts w:ascii="Times New Roman" w:hAnsi="Times New Roman" w:cs="Times New Roman"/>
+          <w:sz w:val="24"/>
+          <w:szCs w:val="24"/>
+        </w:rPr>
+      </w:pPr>
+      <w:hyperlink r:id="rId17" w:history="1">
+        <w:r>
+          <w:rPr>
+            <w:rStyle w:val="Hyperlink"/>
+            <w:rFonts w:ascii="Times New Roman" w:hAnsi="Times New Roman" w:cs="Times New Roman"/>
+            <w:sz w:val="24"/>
+            <w:szCs w:val="24"/>
+          </w:rPr>
+          <w:t>ep342@cornell.edu</w:t>
+        </w:r>
+      </w:hyperlink>
+      <w:r>
+        <w:rPr>
+          <w:rFonts w:ascii="Times New Roman" w:hAnsi="Times New Roman" w:cs="Times New Roman"/>
+          <w:sz w:val="24"/>
+          <w:szCs w:val="24"/>
+        </w:rPr>
+        <w:t xml:space="preserve"> </w:t>
+      </w:r>
+    </w:p>
+    <w:p>
+      <w:pPr>
+        <w:autoSpaceDE w:val="0"/>
+        <w:autoSpaceDN w:val="0"/>
+        <w:adjustRightInd w:val="0"/>
+        <w:spacing w:after="0" w:line="240" w:lineRule="auto"/>
+        <w:rPr>
+          <w:rFonts w:ascii="Times New Roman" w:hAnsi="Times New Roman" w:cs="Times New Roman"/>
+          <w:sz w:val="24"/>
+          <w:szCs w:val="24"/>
+        </w:rPr>
+      </w:pPr>
+    </w:p>
+    <w:p>
+      <w:pPr>
+        <w:autoSpaceDE w:val="0"/>
+        <w:autoSpaceDN w:val="0"/>
+        <w:adjustRightInd w:val="0"/>
+        <w:spacing w:after="0" w:line="240" w:lineRule="auto"/>
+        <w:rPr>
+          <w:rFonts w:ascii="Times New Roman" w:hAnsi="Times New Roman" w:cs="Times New Roman"/>
+          <w:sz w:val="24"/>
+          <w:szCs w:val="24"/>
+        </w:rPr>
+      </w:pPr>
+      <w:proofErr w:type="spellStart"/>
+      <w:r>
+        <w:rPr>
+          <w:rFonts w:ascii="Times New Roman" w:hAnsi="Times New Roman" w:cs="Times New Roman"/>
+          <w:sz w:val="24"/>
+          <w:szCs w:val="24"/>
+        </w:rPr>
+        <w:t>Hyunghoon</w:t>
+      </w:r>
+      <w:proofErr w:type="spellEnd"/>
+      <w:r>
+        <w:rPr>
+          <w:rFonts w:ascii="Times New Roman" w:hAnsi="Times New Roman" w:cs="Times New Roman"/>
+          <w:sz w:val="24"/>
+          <w:szCs w:val="24"/>
+        </w:rPr>
+        <w:t xml:space="preserve"> Cho</w:t>
       </w:r>
     </w:p>
     <w:p>
@@ -3279,7 +4467,7 @@
           <w:szCs w:val="24"/>
         </w:rPr>
       </w:pPr>
-      <w:hyperlink r:id="rId19" w:history="1">
+      <w:hyperlink r:id="rId18" w:history="1">
         <w:r>
           <w:rPr>
             <w:rStyle w:val="Hyperlink"/>
@@ -3316,93 +4504,6 @@
           <w:szCs w:val="24"/>
         </w:rPr>
       </w:pPr>
-      <w:r>
-        <w:rPr>
-          <w:rFonts w:ascii="Times New Roman" w:hAnsi="Times New Roman" w:cs="Times New Roman"/>
-          <w:sz w:val="24"/>
-          <w:szCs w:val="24"/>
-        </w:rPr>
-        <w:t>Jennifer Hoffman</w:t>
-      </w:r>
-    </w:p>
-    <w:p>
-      <w:pPr>
-        <w:autoSpaceDE w:val="0"/>
-        <w:autoSpaceDN w:val="0"/>
-        <w:adjustRightInd w:val="0"/>
-        <w:spacing w:after="0" w:line="240" w:lineRule="auto"/>
-        <w:rPr>
-          <w:rFonts w:ascii="Times New Roman" w:hAnsi="Times New Roman" w:cs="Times New Roman"/>
-          <w:sz w:val="24"/>
-          <w:szCs w:val="24"/>
-        </w:rPr>
-      </w:pPr>
-      <w:r>
-        <w:rPr>
-          <w:rFonts w:ascii="Times New Roman" w:hAnsi="Times New Roman" w:cs="Times New Roman"/>
-          <w:sz w:val="24"/>
-          <w:szCs w:val="24"/>
-        </w:rPr>
-        <w:t>Harvard University</w:t>
-      </w:r>
-    </w:p>
-    <w:p>
-      <w:pPr>
-        <w:autoSpaceDE w:val="0"/>
-        <w:autoSpaceDN w:val="0"/>
-        <w:adjustRightInd w:val="0"/>
-        <w:spacing w:after="0" w:line="240" w:lineRule="auto"/>
-        <w:rPr>
-          <w:rFonts w:ascii="Times New Roman" w:hAnsi="Times New Roman" w:cs="Times New Roman"/>
-          <w:sz w:val="24"/>
-          <w:szCs w:val="24"/>
-        </w:rPr>
-      </w:pPr>
-      <w:r>
-        <w:rPr>
-          <w:rFonts w:ascii="Times New Roman" w:hAnsi="Times New Roman" w:cs="Times New Roman"/>
-          <w:sz w:val="24"/>
-          <w:szCs w:val="24"/>
-        </w:rPr>
-        <w:t>Clowes Professor of Science</w:t>
-      </w:r>
-    </w:p>
-    <w:p>
-      <w:pPr>
-        <w:autoSpaceDE w:val="0"/>
-        <w:autoSpaceDN w:val="0"/>
-        <w:adjustRightInd w:val="0"/>
-        <w:spacing w:after="0" w:line="240" w:lineRule="auto"/>
-        <w:rPr>
-          <w:rFonts w:ascii="Times New Roman" w:hAnsi="Times New Roman" w:cs="Times New Roman"/>
-          <w:sz w:val="24"/>
-          <w:szCs w:val="24"/>
-        </w:rPr>
-      </w:pPr>
-      <w:hyperlink r:id="rId20" w:history="1">
-        <w:r>
-          <w:rPr>
-            <w:rStyle w:val="Hyperlink"/>
-            <w:rFonts w:ascii="Times New Roman" w:hAnsi="Times New Roman" w:cs="Times New Roman"/>
-            <w:sz w:val="24"/>
-            <w:szCs w:val="24"/>
-          </w:rPr>
-          <w:t>jhoffman@g.harvard.edu</w:t>
-        </w:r>
-      </w:hyperlink>
-    </w:p>
-    <w:p>
-      <w:pPr>
-        <w:autoSpaceDE w:val="0"/>
-        <w:autoSpaceDN w:val="0"/>
-        <w:adjustRightInd w:val="0"/>
-        <w:spacing w:after="0" w:line="240" w:lineRule="auto"/>
-        <w:rPr>
-          <w:rFonts w:ascii="Times New Roman" w:hAnsi="Times New Roman" w:cs="Times New Roman"/>
-          <w:sz w:val="24"/>
-          <w:szCs w:val="24"/>
-        </w:rPr>
-      </w:pPr>
     </w:p>
     <w:p>
       <w:pPr>
@@ -3418,7 +4519,7 @@
       </w:pPr>
     </w:p>
     <w:sectPr>
-      <w:footerReference w:type="default" r:id="rId21"/>
+      <w:footerReference w:type="default" r:id="rId19"/>
       <w:pgSz w:w="12240" w:h="15840"/>
       <w:pgMar w:top="1440" w:right="1440" w:bottom="1440" w:left="1440" w:header="720" w:footer="720" w:gutter="0"/>
       <w:cols w:space="720"/>
@@ -3429,7 +4530,7 @@
 </file>
 
 <file path=word/endnotes.xml><?xml version="1.0" encoding="utf-8"?>
-<w:endnotes xmlns:wpc="http://schemas.microsoft.com/office/word/2010/wordprocessingCanvas" xmlns:cx="http://schemas.microsoft.com/office/drawing/2014/chartex" xmlns:cx1="http://schemas.microsoft.com/office/drawing/2015/9/8/chartex" xmlns:cx2="http://schemas.microsoft.com/office/drawing/2015/10/21/chartex" xmlns:cx3="http://schemas.microsoft.com/office/drawing/2016/5/9/chartex" xmlns:cx4="http://schemas.microsoft.com/office/drawing/2016/5/10/chartex" xmlns:cx5="http://schemas.microsoft.com/office/drawing/2016/5/11/chartex" xmlns:cx6="http://schemas.microsoft.com/office/drawing/2016/5/12/chartex" xmlns:cx7="http://schemas.microsoft.com/office/drawing/2016/5/13/chartex" xmlns:cx8="http://schemas.microsoft.com/office/drawing/2016/5/14/chartex" xmlns:mc="http://schemas.openxmlformats.org/markup-compatibility/2006" xmlns:aink="http://schemas.microsoft.com/office/drawing/2016/ink" xmlns:am3d="http://schemas.microsoft.com/office/drawing/2017/model3d" xmlns:o="urn:schemas-microsoft-com:office:office" xmlns:oel="http://schemas.microsoft.com/office/2019/extlst" xmlns:r="http://schemas.openxmlformats.org/officeDocument/2006/relationships" xmlns:m="http://schemas.openxmlformats.org/officeDocument/2006/math" xmlns:v="urn:schemas-microsoft-com:vml" xmlns:wp14="http://schemas.microsoft.com/office/word/2010/wordprocessingDrawing" xmlns:wp="http://schemas.openxmlformats.org/drawingml/2006/wordprocessingDrawing" xmlns:w10="urn:schemas-microsoft-com:office:word" xmlns:w="http://schemas.openxmlformats.org/wordprocessingml/2006/main" xmlns:w14="http://schemas.microsoft.com/office/word/2010/wordml" xmlns:w15="http://schemas.microsoft.com/office/word/2012/wordml" xmlns:w16cex="http://schemas.microsoft.com/office/word/2018/wordml/cex" xmlns:w16cid="http://schemas.microsoft.com/office/word/2016/wordml/cid" xmlns:w16="http://schemas.microsoft.com/office/word/2018/wordml" xmlns:w16sdtdh="http://schemas.microsoft.com/office/word/2020/wordml/sdtdatahash" xmlns:w16se="http://schemas.microsoft.com/office/word/2015/wordml/symex" xmlns:wpg="http://schemas.microsoft.com/office/word/2010/wordprocessingGroup" xmlns:wpi="http://schemas.microsoft.com/office/word/2010/wordprocessingInk" xmlns:wne="http://schemas.microsoft.com/office/word/2006/wordml" xmlns:wps="http://schemas.microsoft.com/office/word/2010/wordprocessingShape" mc:Ignorable="w14 w15 w16se w16cid w16 w16cex w16sdtdh wp14">
+<w:endnotes xmlns:wpc="http://schemas.microsoft.com/office/word/2010/wordprocessingCanvas" xmlns:cx="http://schemas.microsoft.com/office/drawing/2014/chartex" xmlns:cx1="http://schemas.microsoft.com/office/drawing/2015/9/8/chartex" xmlns:cx2="http://schemas.microsoft.com/office/drawing/2015/10/21/chartex" xmlns:cx3="http://schemas.microsoft.com/office/drawing/2016/5/9/chartex" xmlns:cx4="http://schemas.microsoft.com/office/drawing/2016/5/10/chartex" xmlns:cx5="http://schemas.microsoft.com/office/drawing/2016/5/11/chartex" xmlns:cx6="http://schemas.microsoft.com/office/drawing/2016/5/12/chartex" xmlns:cx7="http://schemas.microsoft.com/office/drawing/2016/5/13/chartex" xmlns:cx8="http://schemas.microsoft.com/office/drawing/2016/5/14/chartex" xmlns:mc="http://schemas.openxmlformats.org/markup-compatibility/2006" xmlns:aink="http://schemas.microsoft.com/office/drawing/2016/ink" xmlns:am3d="http://schemas.microsoft.com/office/drawing/2017/model3d" xmlns:o="urn:schemas-microsoft-com:office:office" xmlns:oel="http://schemas.microsoft.com/office/2019/extlst" xmlns:r="http://schemas.openxmlformats.org/officeDocument/2006/relationships" xmlns:m="http://schemas.openxmlformats.org/officeDocument/2006/math" xmlns:v="urn:schemas-microsoft-com:vml" xmlns:wp14="http://schemas.microsoft.com/office/word/2010/wordprocessingDrawing" xmlns:wp="http://schemas.openxmlformats.org/drawingml/2006/wordprocessingDrawing" xmlns:w10="urn:schemas-microsoft-com:office:word" xmlns:w="http://schemas.openxmlformats.org/wordprocessingml/2006/main" xmlns:w14="http://schemas.microsoft.com/office/word/2010/wordml" xmlns:w15="http://schemas.microsoft.com/office/word/2012/wordml" xmlns:w16cex="http://schemas.microsoft.com/office/word/2018/wordml/cex" xmlns:w16cid="http://schemas.microsoft.com/office/word/2016/wordml/cid" xmlns:w16="http://schemas.microsoft.com/office/word/2018/wordml" xmlns:w16du="http://schemas.microsoft.com/office/word/2023/wordml/word16du" xmlns:w16sdtdh="http://schemas.microsoft.com/office/word/2020/wordml/sdtdatahash" xmlns:w16se="http://schemas.microsoft.com/office/word/2015/wordml/symex" xmlns:wpg="http://schemas.microsoft.com/office/word/2010/wordprocessingGroup" xmlns:wpi="http://schemas.microsoft.com/office/word/2010/wordprocessingInk" xmlns:wne="http://schemas.microsoft.com/office/word/2006/wordml" xmlns:wps="http://schemas.microsoft.com/office/word/2010/wordprocessingShape" mc:Ignorable="w14 w15 w16se w16cid w16 w16cex w16sdtdh w16du wp14">
   <w:endnote w:type="separator" w:id="-1">
     <w:p>
       <w:pPr>
@@ -3454,7 +4555,7 @@
 </file>
 
 <file path=word/footer1.xml><?xml version="1.0" encoding="utf-8"?>
-<w:ftr xmlns:wpc="http://schemas.microsoft.com/office/word/2010/wordprocessingCanvas" xmlns:cx="http://schemas.microsoft.com/office/drawing/2014/chartex" xmlns:cx1="http://schemas.microsoft.com/office/drawing/2015/9/8/chartex" xmlns:cx2="http://schemas.microsoft.com/office/drawing/2015/10/21/chartex" xmlns:cx3="http://schemas.microsoft.com/office/drawing/2016/5/9/chartex" xmlns:cx4="http://schemas.microsoft.com/office/drawing/2016/5/10/chartex" xmlns:cx5="http://schemas.microsoft.com/office/drawing/2016/5/11/chartex" xmlns:cx6="http://schemas.microsoft.com/office/drawing/2016/5/12/chartex" xmlns:cx7="http://schemas.microsoft.com/office/drawing/2016/5/13/chartex" xmlns:cx8="http://schemas.microsoft.com/office/drawing/2016/5/14/chartex" xmlns:mc="http://schemas.openxmlformats.org/markup-compatibility/2006" xmlns:aink="http://schemas.microsoft.com/office/drawing/2016/ink" xmlns:am3d="http://schemas.microsoft.com/office/drawing/2017/model3d" xmlns:o="urn:schemas-microsoft-com:office:office" xmlns:oel="http://schemas.microsoft.com/office/2019/extlst" xmlns:r="http://schemas.openxmlformats.org/officeDocument/2006/relationships" xmlns:m="http://schemas.openxmlformats.org/officeDocument/2006/math" xmlns:v="urn:schemas-microsoft-com:vml" xmlns:wp14="http://schemas.microsoft.com/office/word/2010/wordprocessingDrawing" xmlns:wp="http://schemas.openxmlformats.org/drawingml/2006/wordprocessingDrawing" xmlns:w10="urn:schemas-microsoft-com:office:word" xmlns:w="http://schemas.openxmlformats.org/wordprocessingml/2006/main" xmlns:w14="http://schemas.microsoft.com/office/word/2010/wordml" xmlns:w15="http://schemas.microsoft.com/office/word/2012/wordml" xmlns:w16cex="http://schemas.microsoft.com/office/word/2018/wordml/cex" xmlns:w16cid="http://schemas.microsoft.com/office/word/2016/wordml/cid" xmlns:w16="http://schemas.microsoft.com/office/word/2018/wordml" xmlns:w16sdtdh="http://schemas.microsoft.com/office/word/2020/wordml/sdtdatahash" xmlns:w16se="http://schemas.microsoft.com/office/word/2015/wordml/symex" xmlns:wpg="http://schemas.microsoft.com/office/word/2010/wordprocessingGroup" xmlns:wpi="http://schemas.microsoft.com/office/word/2010/wordprocessingInk" xmlns:wne="http://schemas.microsoft.com/office/word/2006/wordml" xmlns:wps="http://schemas.microsoft.com/office/word/2010/wordprocessingShape" mc:Ignorable="w14 w15 w16se w16cid w16 w16cex w16sdtdh wp14">
+<w:ftr xmlns:wpc="http://schemas.microsoft.com/office/word/2010/wordprocessingCanvas" xmlns:cx="http://schemas.microsoft.com/office/drawing/2014/chartex" xmlns:cx1="http://schemas.microsoft.com/office/drawing/2015/9/8/chartex" xmlns:cx2="http://schemas.microsoft.com/office/drawing/2015/10/21/chartex" xmlns:cx3="http://schemas.microsoft.com/office/drawing/2016/5/9/chartex" xmlns:cx4="http://schemas.microsoft.com/office/drawing/2016/5/10/chartex" xmlns:cx5="http://schemas.microsoft.com/office/drawing/2016/5/11/chartex" xmlns:cx6="http://schemas.microsoft.com/office/drawing/2016/5/12/chartex" xmlns:cx7="http://schemas.microsoft.com/office/drawing/2016/5/13/chartex" xmlns:cx8="http://schemas.microsoft.com/office/drawing/2016/5/14/chartex" xmlns:mc="http://schemas.openxmlformats.org/markup-compatibility/2006" xmlns:aink="http://schemas.microsoft.com/office/drawing/2016/ink" xmlns:am3d="http://schemas.microsoft.com/office/drawing/2017/model3d" xmlns:o="urn:schemas-microsoft-com:office:office" xmlns:oel="http://schemas.microsoft.com/office/2019/extlst" xmlns:r="http://schemas.openxmlformats.org/officeDocument/2006/relationships" xmlns:m="http://schemas.openxmlformats.org/officeDocument/2006/math" xmlns:v="urn:schemas-microsoft-com:vml" xmlns:wp14="http://schemas.microsoft.com/office/word/2010/wordprocessingDrawing" xmlns:wp="http://schemas.openxmlformats.org/drawingml/2006/wordprocessingDrawing" xmlns:w10="urn:schemas-microsoft-com:office:word" xmlns:w="http://schemas.openxmlformats.org/wordprocessingml/2006/main" xmlns:w14="http://schemas.microsoft.com/office/word/2010/wordml" xmlns:w15="http://schemas.microsoft.com/office/word/2012/wordml" xmlns:w16cex="http://schemas.microsoft.com/office/word/2018/wordml/cex" xmlns:w16cid="http://schemas.microsoft.com/office/word/2016/wordml/cid" xmlns:w16="http://schemas.microsoft.com/office/word/2018/wordml" xmlns:w16du="http://schemas.microsoft.com/office/word/2023/wordml/word16du" xmlns:w16sdtdh="http://schemas.microsoft.com/office/word/2020/wordml/sdtdatahash" xmlns:w16se="http://schemas.microsoft.com/office/word/2015/wordml/symex" xmlns:wpg="http://schemas.microsoft.com/office/word/2010/wordprocessingGroup" xmlns:wpi="http://schemas.microsoft.com/office/word/2010/wordprocessingInk" xmlns:wne="http://schemas.microsoft.com/office/word/2006/wordml" xmlns:wps="http://schemas.microsoft.com/office/word/2010/wordprocessingShape" mc:Ignorable="w14 w15 w16se w16cid w16 w16cex w16sdtdh w16du wp14">
   <w:p>
     <w:pPr>
       <w:pStyle w:val="Footer"/>
@@ -3463,18 +4564,34 @@
         <w:rFonts w:ascii="Times New Roman" w:hAnsi="Times New Roman" w:cs="Times New Roman"/>
       </w:rPr>
     </w:pPr>
+    <w:proofErr w:type="spellStart"/>
     <w:r>
       <w:rPr>
         <w:rFonts w:ascii="Times New Roman" w:hAnsi="Times New Roman" w:cs="Times New Roman"/>
       </w:rPr>
-      <w:t>Shuvom Sadhuka</w:t>
+      <w:t>Shuvom</w:t>
     </w:r>
+    <w:proofErr w:type="spellEnd"/>
+    <w:r>
+      <w:rPr>
+        <w:rFonts w:ascii="Times New Roman" w:hAnsi="Times New Roman" w:cs="Times New Roman"/>
+      </w:rPr>
+      <w:t xml:space="preserve"> </w:t>
+    </w:r>
+    <w:proofErr w:type="spellStart"/>
+    <w:r>
+      <w:rPr>
+        <w:rFonts w:ascii="Times New Roman" w:hAnsi="Times New Roman" w:cs="Times New Roman"/>
+      </w:rPr>
+      <w:t>Sadhuka</w:t>
+    </w:r>
+    <w:proofErr w:type="spellEnd"/>
   </w:p>
 </w:ftr>
 </file>
 
 <file path=word/footnotes.xml><?xml version="1.0" encoding="utf-8"?>
-<w:footnotes xmlns:wpc="http://schemas.microsoft.com/office/word/2010/wordprocessingCanvas" xmlns:cx="http://schemas.microsoft.com/office/drawing/2014/chartex" xmlns:cx1="http://schemas.microsoft.com/office/drawing/2015/9/8/chartex" xmlns:cx2="http://schemas.microsoft.com/office/drawing/2015/10/21/chartex" xmlns:cx3="http://schemas.microsoft.com/office/drawing/2016/5/9/chartex" xmlns:cx4="http://schemas.microsoft.com/office/drawing/2016/5/10/chartex" xmlns:cx5="http://schemas.microsoft.com/office/drawing/2016/5/11/chartex" xmlns:cx6="http://schemas.microsoft.com/office/drawing/2016/5/12/chartex" xmlns:cx7="http://schemas.microsoft.com/office/drawing/2016/5/13/chartex" xmlns:cx8="http://schemas.microsoft.com/office/drawing/2016/5/14/chartex" xmlns:mc="http://schemas.openxmlformats.org/markup-compatibility/2006" xmlns:aink="http://schemas.microsoft.com/office/drawing/2016/ink" xmlns:am3d="http://schemas.microsoft.com/office/drawing/2017/model3d" xmlns:o="urn:schemas-microsoft-com:office:office" xmlns:oel="http://schemas.microsoft.com/office/2019/extlst" xmlns:r="http://schemas.openxmlformats.org/officeDocument/2006/relationships" xmlns:m="http://schemas.openxmlformats.org/officeDocument/2006/math" xmlns:v="urn:schemas-microsoft-com:vml" xmlns:wp14="http://schemas.microsoft.com/office/word/2010/wordprocessingDrawing" xmlns:wp="http://schemas.openxmlformats.org/drawingml/2006/wordprocessingDrawing" xmlns:w10="urn:schemas-microsoft-com:office:word" xmlns:w="http://schemas.openxmlformats.org/wordprocessingml/2006/main" xmlns:w14="http://schemas.microsoft.com/office/word/2010/wordml" xmlns:w15="http://schemas.microsoft.com/office/word/2012/wordml" xmlns:w16cex="http://schemas.microsoft.com/office/word/2018/wordml/cex" xmlns:w16cid="http://schemas.microsoft.com/office/word/2016/wordml/cid" xmlns:w16="http://schemas.microsoft.com/office/word/2018/wordml" xmlns:w16sdtdh="http://schemas.microsoft.com/office/word/2020/wordml/sdtdatahash" xmlns:w16se="http://schemas.microsoft.com/office/word/2015/wordml/symex" xmlns:wpg="http://schemas.microsoft.com/office/word/2010/wordprocessingGroup" xmlns:wpi="http://schemas.microsoft.com/office/word/2010/wordprocessingInk" xmlns:wne="http://schemas.microsoft.com/office/word/2006/wordml" xmlns:wps="http://schemas.microsoft.com/office/word/2010/wordprocessingShape" mc:Ignorable="w14 w15 w16se w16cid w16 w16cex w16sdtdh wp14">
+<w:footnotes xmlns:wpc="http://schemas.microsoft.com/office/word/2010/wordprocessingCanvas" xmlns:cx="http://schemas.microsoft.com/office/drawing/2014/chartex" xmlns:cx1="http://schemas.microsoft.com/office/drawing/2015/9/8/chartex" xmlns:cx2="http://schemas.microsoft.com/office/drawing/2015/10/21/chartex" xmlns:cx3="http://schemas.microsoft.com/office/drawing/2016/5/9/chartex" xmlns:cx4="http://schemas.microsoft.com/office/drawing/2016/5/10/chartex" xmlns:cx5="http://schemas.microsoft.com/office/drawing/2016/5/11/chartex" xmlns:cx6="http://schemas.microsoft.com/office/drawing/2016/5/12/chartex" xmlns:cx7="http://schemas.microsoft.com/office/drawing/2016/5/13/chartex" xmlns:cx8="http://schemas.microsoft.com/office/drawing/2016/5/14/chartex" xmlns:mc="http://schemas.openxmlformats.org/markup-compatibility/2006" xmlns:aink="http://schemas.microsoft.com/office/drawing/2016/ink" xmlns:am3d="http://schemas.microsoft.com/office/drawing/2017/model3d" xmlns:o="urn:schemas-microsoft-com:office:office" xmlns:oel="http://schemas.microsoft.com/office/2019/extlst" xmlns:r="http://schemas.openxmlformats.org/officeDocument/2006/relationships" xmlns:m="http://schemas.openxmlformats.org/officeDocument/2006/math" xmlns:v="urn:schemas-microsoft-com:vml" xmlns:wp14="http://schemas.microsoft.com/office/word/2010/wordprocessingDrawing" xmlns:wp="http://schemas.openxmlformats.org/drawingml/2006/wordprocessingDrawing" xmlns:w10="urn:schemas-microsoft-com:office:word" xmlns:w="http://schemas.openxmlformats.org/wordprocessingml/2006/main" xmlns:w14="http://schemas.microsoft.com/office/word/2010/wordml" xmlns:w15="http://schemas.microsoft.com/office/word/2012/wordml" xmlns:w16cex="http://schemas.microsoft.com/office/word/2018/wordml/cex" xmlns:w16cid="http://schemas.microsoft.com/office/word/2016/wordml/cid" xmlns:w16="http://schemas.microsoft.com/office/word/2018/wordml" xmlns:w16du="http://schemas.microsoft.com/office/word/2023/wordml/word16du" xmlns:w16sdtdh="http://schemas.microsoft.com/office/word/2020/wordml/sdtdatahash" xmlns:w16se="http://schemas.microsoft.com/office/word/2015/wordml/symex" xmlns:wpg="http://schemas.microsoft.com/office/word/2010/wordprocessingGroup" xmlns:wpi="http://schemas.microsoft.com/office/word/2010/wordprocessingInk" xmlns:wne="http://schemas.microsoft.com/office/word/2006/wordml" xmlns:wps="http://schemas.microsoft.com/office/word/2010/wordprocessingShape" mc:Ignorable="w14 w15 w16se w16cid w16 w16cex w16sdtdh w16du wp14">
   <w:footnote w:type="separator" w:id="-1">
     <w:p>
       <w:pPr>
@@ -3499,7 +4616,7 @@
 </file>
 
 <file path=word/numbering.xml><?xml version="1.0" encoding="utf-8"?>
-<w:numbering xmlns:wpc="http://schemas.microsoft.com/office/word/2010/wordprocessingCanvas" xmlns:cx="http://schemas.microsoft.com/office/drawing/2014/chartex" xmlns:cx1="http://schemas.microsoft.com/office/drawing/2015/9/8/chartex" xmlns:cx2="http://schemas.microsoft.com/office/drawing/2015/10/21/chartex" xmlns:cx3="http://schemas.microsoft.com/office/drawing/2016/5/9/chartex" xmlns:cx4="http://schemas.microsoft.com/office/drawing/2016/5/10/chartex" xmlns:cx5="http://schemas.microsoft.com/office/drawing/2016/5/11/chartex" xmlns:cx6="http://schemas.microsoft.com/office/drawing/2016/5/12/chartex" xmlns:cx7="http://schemas.microsoft.com/office/drawing/2016/5/13/chartex" xmlns:cx8="http://schemas.microsoft.com/office/drawing/2016/5/14/chartex" xmlns:mc="http://schemas.openxmlformats.org/markup-compatibility/2006" xmlns:aink="http://schemas.microsoft.com/office/drawing/2016/ink" xmlns:am3d="http://schemas.microsoft.com/office/drawing/2017/model3d" xmlns:o="urn:schemas-microsoft-com:office:office" xmlns:oel="http://schemas.microsoft.com/office/2019/extlst" xmlns:r="http://schemas.openxmlformats.org/officeDocument/2006/relationships" xmlns:m="http://schemas.openxmlformats.org/officeDocument/2006/math" xmlns:v="urn:schemas-microsoft-com:vml" xmlns:wp14="http://schemas.microsoft.com/office/word/2010/wordprocessingDrawing" xmlns:wp="http://schemas.openxmlformats.org/drawingml/2006/wordprocessingDrawing" xmlns:w10="urn:schemas-microsoft-com:office:word" xmlns:w="http://schemas.openxmlformats.org/wordprocessingml/2006/main" xmlns:w14="http://schemas.microsoft.com/office/word/2010/wordml" xmlns:w15="http://schemas.microsoft.com/office/word/2012/wordml" xmlns:w16cex="http://schemas.microsoft.com/office/word/2018/wordml/cex" xmlns:w16cid="http://schemas.microsoft.com/office/word/2016/wordml/cid" xmlns:w16="http://schemas.microsoft.com/office/word/2018/wordml" xmlns:w16sdtdh="http://schemas.microsoft.com/office/word/2020/wordml/sdtdatahash" xmlns:w16se="http://schemas.microsoft.com/office/word/2015/wordml/symex" xmlns:wpg="http://schemas.microsoft.com/office/word/2010/wordprocessingGroup" xmlns:wpi="http://schemas.microsoft.com/office/word/2010/wordprocessingInk" xmlns:wne="http://schemas.microsoft.com/office/word/2006/wordml" xmlns:wps="http://schemas.microsoft.com/office/word/2010/wordprocessingShape" mc:Ignorable="w14 w15 w16se w16cid w16 w16cex w16sdtdh wp14">
+<w:numbering xmlns:wpc="http://schemas.microsoft.com/office/word/2010/wordprocessingCanvas" xmlns:cx="http://schemas.microsoft.com/office/drawing/2014/chartex" xmlns:cx1="http://schemas.microsoft.com/office/drawing/2015/9/8/chartex" xmlns:cx2="http://schemas.microsoft.com/office/drawing/2015/10/21/chartex" xmlns:cx3="http://schemas.microsoft.com/office/drawing/2016/5/9/chartex" xmlns:cx4="http://schemas.microsoft.com/office/drawing/2016/5/10/chartex" xmlns:cx5="http://schemas.microsoft.com/office/drawing/2016/5/11/chartex" xmlns:cx6="http://schemas.microsoft.com/office/drawing/2016/5/12/chartex" xmlns:cx7="http://schemas.microsoft.com/office/drawing/2016/5/13/chartex" xmlns:cx8="http://schemas.microsoft.com/office/drawing/2016/5/14/chartex" xmlns:mc="http://schemas.openxmlformats.org/markup-compatibility/2006" xmlns:aink="http://schemas.microsoft.com/office/drawing/2016/ink" xmlns:am3d="http://schemas.microsoft.com/office/drawing/2017/model3d" xmlns:o="urn:schemas-microsoft-com:office:office" xmlns:oel="http://schemas.microsoft.com/office/2019/extlst" xmlns:r="http://schemas.openxmlformats.org/officeDocument/2006/relationships" xmlns:m="http://schemas.openxmlformats.org/officeDocument/2006/math" xmlns:v="urn:schemas-microsoft-com:vml" xmlns:wp14="http://schemas.microsoft.com/office/word/2010/wordprocessingDrawing" xmlns:wp="http://schemas.openxmlformats.org/drawingml/2006/wordprocessingDrawing" xmlns:w10="urn:schemas-microsoft-com:office:word" xmlns:w="http://schemas.openxmlformats.org/wordprocessingml/2006/main" xmlns:w14="http://schemas.microsoft.com/office/word/2010/wordml" xmlns:w15="http://schemas.microsoft.com/office/word/2012/wordml" xmlns:w16cex="http://schemas.microsoft.com/office/word/2018/wordml/cex" xmlns:w16cid="http://schemas.microsoft.com/office/word/2016/wordml/cid" xmlns:w16="http://schemas.microsoft.com/office/word/2018/wordml" xmlns:w16du="http://schemas.microsoft.com/office/word/2023/wordml/word16du" xmlns:w16sdtdh="http://schemas.microsoft.com/office/word/2020/wordml/sdtdatahash" xmlns:w16se="http://schemas.microsoft.com/office/word/2015/wordml/symex" xmlns:wpg="http://schemas.microsoft.com/office/word/2010/wordprocessingGroup" xmlns:wpi="http://schemas.microsoft.com/office/word/2010/wordprocessingInk" xmlns:wne="http://schemas.microsoft.com/office/word/2006/wordml" xmlns:wps="http://schemas.microsoft.com/office/word/2010/wordprocessingShape" mc:Ignorable="w14 w15 w16se w16cid w16 w16cex w16sdtdh w16du wp14">
   <w:abstractNum w:abstractNumId="0" w15:restartNumberingAfterBreak="0">
     <w:nsid w:val="108E54CC"/>
     <w:multiLevelType w:val="hybridMultilevel"/>
@@ -3953,6 +5070,119 @@
     </w:lvl>
   </w:abstractNum>
   <w:abstractNum w:abstractNumId="4" w15:restartNumberingAfterBreak="0">
+    <w:nsid w:val="40280E8F"/>
+    <w:multiLevelType w:val="hybridMultilevel"/>
+    <w:tmpl w:val="6CD6A91A"/>
+    <w:lvl w:ilvl="0" w:tplc="04090001">
+      <w:start w:val="1"/>
+      <w:numFmt w:val="bullet"/>
+      <w:lvlText w:val=""/>
+      <w:lvlJc w:val="left"/>
+      <w:pPr>
+        <w:ind w:left="720" w:hanging="360"/>
+      </w:pPr>
+      <w:rPr>
+        <w:rFonts w:ascii="Symbol" w:hAnsi="Symbol" w:hint="default"/>
+      </w:rPr>
+    </w:lvl>
+    <w:lvl w:ilvl="1" w:tplc="04090003" w:tentative="1">
+      <w:start w:val="1"/>
+      <w:numFmt w:val="bullet"/>
+      <w:lvlText w:val="o"/>
+      <w:lvlJc w:val="left"/>
+      <w:pPr>
+        <w:ind w:left="1440" w:hanging="360"/>
+      </w:pPr>
+      <w:rPr>
+        <w:rFonts w:ascii="Courier New" w:hAnsi="Courier New" w:cs="Courier New" w:hint="default"/>
+      </w:rPr>
+    </w:lvl>
+    <w:lvl w:ilvl="2" w:tplc="04090005" w:tentative="1">
+      <w:start w:val="1"/>
+      <w:numFmt w:val="bullet"/>
+      <w:lvlText w:val=""/>
+      <w:lvlJc w:val="left"/>
+      <w:pPr>
+        <w:ind w:left="2160" w:hanging="360"/>
+      </w:pPr>
+      <w:rPr>
+        <w:rFonts w:ascii="Wingdings" w:hAnsi="Wingdings" w:hint="default"/>
+      </w:rPr>
+    </w:lvl>
+    <w:lvl w:ilvl="3" w:tplc="04090001" w:tentative="1">
+      <w:start w:val="1"/>
+      <w:numFmt w:val="bullet"/>
+      <w:lvlText w:val=""/>
+      <w:lvlJc w:val="left"/>
+      <w:pPr>
+        <w:ind w:left="2880" w:hanging="360"/>
+      </w:pPr>
+      <w:rPr>
+        <w:rFonts w:ascii="Symbol" w:hAnsi="Symbol" w:hint="default"/>
+      </w:rPr>
+    </w:lvl>
+    <w:lvl w:ilvl="4" w:tplc="04090003" w:tentative="1">
+      <w:start w:val="1"/>
+      <w:numFmt w:val="bullet"/>
+      <w:lvlText w:val="o"/>
+      <w:lvlJc w:val="left"/>
+      <w:pPr>
+        <w:ind w:left="3600" w:hanging="360"/>
+      </w:pPr>
+      <w:rPr>
+        <w:rFonts w:ascii="Courier New" w:hAnsi="Courier New" w:cs="Courier New" w:hint="default"/>
+      </w:rPr>
+    </w:lvl>
+    <w:lvl w:ilvl="5" w:tplc="04090005" w:tentative="1">
+      <w:start w:val="1"/>
+      <w:numFmt w:val="bullet"/>
+      <w:lvlText w:val=""/>
+      <w:lvlJc w:val="left"/>
+      <w:pPr>
+        <w:ind w:left="4320" w:hanging="360"/>
+      </w:pPr>
+      <w:rPr>
+        <w:rFonts w:ascii="Wingdings" w:hAnsi="Wingdings" w:hint="default"/>
+      </w:rPr>
+    </w:lvl>
+    <w:lvl w:ilvl="6" w:tplc="04090001" w:tentative="1">
+      <w:start w:val="1"/>
+      <w:numFmt w:val="bullet"/>
+      <w:lvlText w:val=""/>
+      <w:lvlJc w:val="left"/>
+      <w:pPr>
+        <w:ind w:left="5040" w:hanging="360"/>
+      </w:pPr>
+      <w:rPr>
+        <w:rFonts w:ascii="Symbol" w:hAnsi="Symbol" w:hint="default"/>
+      </w:rPr>
+    </w:lvl>
+    <w:lvl w:ilvl="7" w:tplc="04090003" w:tentative="1">
+      <w:start w:val="1"/>
+      <w:numFmt w:val="bullet"/>
+      <w:lvlText w:val="o"/>
+      <w:lvlJc w:val="left"/>
+      <w:pPr>
+        <w:ind w:left="5760" w:hanging="360"/>
+      </w:pPr>
+      <w:rPr>
+        <w:rFonts w:ascii="Courier New" w:hAnsi="Courier New" w:cs="Courier New" w:hint="default"/>
+      </w:rPr>
+    </w:lvl>
+    <w:lvl w:ilvl="8" w:tplc="04090005" w:tentative="1">
+      <w:start w:val="1"/>
+      <w:numFmt w:val="bullet"/>
+      <w:lvlText w:val=""/>
+      <w:lvlJc w:val="left"/>
+      <w:pPr>
+        <w:ind w:left="6480" w:hanging="360"/>
+      </w:pPr>
+      <w:rPr>
+        <w:rFonts w:ascii="Wingdings" w:hAnsi="Wingdings" w:hint="default"/>
+      </w:rPr>
+    </w:lvl>
+  </w:abstractNum>
+  <w:abstractNum w:abstractNumId="5" w15:restartNumberingAfterBreak="0">
     <w:nsid w:val="5A6A5DD2"/>
     <w:multiLevelType w:val="hybridMultilevel"/>
     <w:tmpl w:val="0C2A21CC"/>
@@ -4065,7 +5295,7 @@
       </w:rPr>
     </w:lvl>
   </w:abstractNum>
-  <w:abstractNum w:abstractNumId="5" w15:restartNumberingAfterBreak="0">
+  <w:abstractNum w:abstractNumId="6" w15:restartNumberingAfterBreak="0">
     <w:nsid w:val="5B7D1604"/>
     <w:multiLevelType w:val="hybridMultilevel"/>
     <w:tmpl w:val="8576760A"/>
@@ -4178,7 +5408,7 @@
       </w:rPr>
     </w:lvl>
   </w:abstractNum>
-  <w:abstractNum w:abstractNumId="6" w15:restartNumberingAfterBreak="0">
+  <w:abstractNum w:abstractNumId="7" w15:restartNumberingAfterBreak="0">
     <w:nsid w:val="6EF8748C"/>
     <w:multiLevelType w:val="hybridMultilevel"/>
     <w:tmpl w:val="F138B0D6"/>
@@ -4291,7 +5521,7 @@
       </w:rPr>
     </w:lvl>
   </w:abstractNum>
-  <w:abstractNum w:abstractNumId="7" w15:restartNumberingAfterBreak="0">
+  <w:abstractNum w:abstractNumId="8" w15:restartNumberingAfterBreak="0">
     <w:nsid w:val="79587802"/>
     <w:multiLevelType w:val="hybridMultilevel"/>
     <w:tmpl w:val="7430C8CC"/>
@@ -4404,10 +5634,10 @@
       </w:rPr>
     </w:lvl>
   </w:abstractNum>
-  <w:abstractNum w:abstractNumId="8" w15:restartNumberingAfterBreak="0">
+  <w:abstractNum w:abstractNumId="9" w15:restartNumberingAfterBreak="0">
     <w:nsid w:val="7C5A61C2"/>
     <w:multiLevelType w:val="hybridMultilevel"/>
-    <w:tmpl w:val="E2EAAC8A"/>
+    <w:tmpl w:val="29DE708C"/>
     <w:lvl w:ilvl="0" w:tplc="04090001">
       <w:start w:val="1"/>
       <w:numFmt w:val="bullet"/>
@@ -4518,7 +5748,7 @@
     </w:lvl>
   </w:abstractNum>
   <w:num w:numId="1" w16cid:durableId="298262771">
-    <w:abstractNumId w:val="5"/>
+    <w:abstractNumId w:val="6"/>
   </w:num>
   <w:num w:numId="2" w16cid:durableId="815076116">
     <w:abstractNumId w:val="0"/>
@@ -4533,22 +5763,25 @@
     <w:abstractNumId w:val="3"/>
   </w:num>
   <w:num w:numId="6" w16cid:durableId="1067875030">
+    <w:abstractNumId w:val="8"/>
+  </w:num>
+  <w:num w:numId="7" w16cid:durableId="1115979560">
+    <w:abstractNumId w:val="9"/>
+  </w:num>
+  <w:num w:numId="8" w16cid:durableId="2001494621">
+    <w:abstractNumId w:val="5"/>
+  </w:num>
+  <w:num w:numId="9" w16cid:durableId="983238221">
     <w:abstractNumId w:val="7"/>
   </w:num>
-  <w:num w:numId="7" w16cid:durableId="1115979560">
-    <w:abstractNumId w:val="8"/>
-  </w:num>
-  <w:num w:numId="8" w16cid:durableId="2001494621">
+  <w:num w:numId="10" w16cid:durableId="1048991147">
     <w:abstractNumId w:val="4"/>
-  </w:num>
-  <w:num w:numId="9" w16cid:durableId="983238221">
-    <w:abstractNumId w:val="6"/>
   </w:num>
 </w:numbering>
 </file>
 
 <file path=word/styles.xml><?xml version="1.0" encoding="utf-8"?>
-<w:styles xmlns:mc="http://schemas.openxmlformats.org/markup-compatibility/2006" xmlns:r="http://schemas.openxmlformats.org/officeDocument/2006/relationships" xmlns:w="http://schemas.openxmlformats.org/wordprocessingml/2006/main" xmlns:w14="http://schemas.microsoft.com/office/word/2010/wordml" xmlns:w15="http://schemas.microsoft.com/office/word/2012/wordml" xmlns:w16cex="http://schemas.microsoft.com/office/word/2018/wordml/cex" xmlns:w16cid="http://schemas.microsoft.com/office/word/2016/wordml/cid" xmlns:w16="http://schemas.microsoft.com/office/word/2018/wordml" xmlns:w16sdtdh="http://schemas.microsoft.com/office/word/2020/wordml/sdtdatahash" xmlns:w16se="http://schemas.microsoft.com/office/word/2015/wordml/symex" mc:Ignorable="w14 w15 w16se w16cid w16 w16cex w16sdtdh">
+<w:styles xmlns:mc="http://schemas.openxmlformats.org/markup-compatibility/2006" xmlns:r="http://schemas.openxmlformats.org/officeDocument/2006/relationships" xmlns:w="http://schemas.openxmlformats.org/wordprocessingml/2006/main" xmlns:w14="http://schemas.microsoft.com/office/word/2010/wordml" xmlns:w15="http://schemas.microsoft.com/office/word/2012/wordml" xmlns:w16cex="http://schemas.microsoft.com/office/word/2018/wordml/cex" xmlns:w16cid="http://schemas.microsoft.com/office/word/2016/wordml/cid" xmlns:w16="http://schemas.microsoft.com/office/word/2018/wordml" xmlns:w16du="http://schemas.microsoft.com/office/word/2023/wordml/word16du" xmlns:w16sdtdh="http://schemas.microsoft.com/office/word/2020/wordml/sdtdatahash" xmlns:w16se="http://schemas.microsoft.com/office/word/2015/wordml/symex" mc:Ignorable="w14 w15 w16se w16cid w16 w16cex w16sdtdh w16du">
   <w:docDefaults>
     <w:rPrDefault>
       <w:rPr>

</xml_diff>